<commit_message>
Văn bản hợp đồng hoàn chỉnh: mọi chỗ trống của mẫu nhập được, lưu theo hợp đồng (0186)
- convert.py: mọi dải chấm còn lại → {o_N} kèm câu văn quanh nó, Điều, mức mặc định (chữ «(mặc
  định: …)» tự mất khi điền); lựa chọn [a/b] → {c_N}; «☐ Phương án» → khối điều kiện {#pa_N_x}.
- contract_templates.free_fields / options; bảng contract_document_inputs (RLS theo hợp đồng, pháp
  nhân do CSDL đặt) — ô điền tay không còn mất khi tải lại trang.
- Cột trái «Nội dung riêng của văn bản»: chia theo Điều, chọn phương án, điền mức mặc định, tự lưu.
  Khung ô thiếu tính cả phần này.
- Phép thử: 21 mẫu đọc / điền được; RLS bảng mới (nới chính sách đọc → đỏ).

Co-Authored-By: Claude Opus 5.5 <noreply@anthropic.com>
</commit_message>
<xml_diff>
--- a/db/seed-assets/contract-templates/NVC/NVC-DC-04_Hop_dong_nguyen_tac_nha_cung_cap.docx
+++ b/db/seed-assets/contract-templates/NVC/NVC-DC-04_Hop_dong_nguyen_tac_nha_cung_cap.docx
@@ -143,7 +143,7 @@
                 <w:sz w:val="24"/>
                 <w:szCs w:val="24"/>
               </w:rPr>
-              <w:t xml:space="preserve">……………, ngày {ngay_ky_ngay} tháng {ngay_ky_thang} năm {ngay_ky_nam}</w:t>
+              <w:t xml:space="preserve">{o_1}, ngày {ngay_ky_ngay} tháng {ngay_ky_thang} năm {ngay_ky_nam}</w:t>
             </w:r>
           </w:p>
         </w:tc>
@@ -299,7 +299,7 @@
           <w:sz w:val="26"/>
           <w:szCs w:val="26"/>
         </w:rPr>
-        <w:t xml:space="preserve">Hôm nay, ngày {ngay_ky_ngay} tháng {ngay_ky_thang} năm {ngay_ky_nam}, tại ……………………………………, chúng tôi gồm:</w:t>
+        <w:t xml:space="preserve">Hôm nay, ngày {ngay_ky_ngay} tháng {ngay_ky_thang} năm {ngay_ky_nam}, tại {o_2}, chúng tôi gồm:</w:t>
       </w:r>
     </w:p>
     <w:p>
@@ -408,7 +408,7 @@
           <w:sz w:val="26"/>
           <w:szCs w:val="26"/>
         </w:rPr>
-        <w:t xml:space="preserve">(Hoặc người được ủy quyền: ……………………… – Chức vụ: ……………… – theo Giấy ủy quyền số ……… ngày ……/……/………)</w:t>
+        <w:t xml:space="preserve">(Hoặc người được ủy quyền: {o_3} – Chức vụ: {o_4} – theo Giấy ủy quyền số {o_5} ngày {o_6})</w:t>
       </w:r>
     </w:p>
     <w:p>
@@ -517,7 +517,7 @@
           <w:sz w:val="26"/>
           <w:szCs w:val="26"/>
         </w:rPr>
-        <w:t xml:space="preserve">(Theo Giấy ủy quyền số ……… ngày ……/……/……… – nếu người ký không phải đại diện theo pháp luật)</w:t>
+        <w:t xml:space="preserve">(Theo Giấy ủy quyền số {o_7} ngày {o_8} – nếu người ký không phải đại diện theo pháp luật)</w:t>
       </w:r>
     </w:p>
     <w:p>
@@ -628,7 +628,7 @@
           <w:sz w:val="26"/>
           <w:szCs w:val="26"/>
         </w:rPr>
-        <w:t xml:space="preserve"> (mẫu tại Phụ lục 02) do người có thẩm quyền của Bên A ký và gửi qua email/văn bản; Bên B xác nhận trong vòng …… (mặc định: 04) giờ làm việc. Đơn đặt hàng đã xác nhận là bộ phận không tách rời của Hợp đồng.</w:t>
+        <w:t xml:space="preserve"> (mẫu tại Phụ lục 02) do người có thẩm quyền của Bên A ký và gửi qua email/văn bản; Bên B xác nhận trong vòng {o_9}  giờ làm việc. Đơn đặt hàng đã xác nhận là bộ phận không tách rời của Hợp đồng.</w:t>
       </w:r>
     </w:p>
     <w:p>
@@ -674,7 +674,7 @@
           <w:sz w:val="26"/>
           <w:szCs w:val="26"/>
         </w:rPr>
-        <w:t xml:space="preserve">2.1. Đơn giá áp dụng theo Phụ lục 01, [đã bao gồm/chưa bao gồm] thuế GTGT, [đã bao gồm] chi phí vận chuyển và bốc xếp đến công trình của Bên A theo địa chỉ ghi trên Đơn đặt hàng.</w:t>
+        <w:t xml:space="preserve">2.1. Đơn giá áp dụng theo Phụ lục 01, {c_1} thuế GTGT, [đã bao gồm] chi phí vận chuyển và bốc xếp đến công trình của Bên A theo địa chỉ ghi trên Đơn đặt hàng.</w:t>
       </w:r>
     </w:p>
     <w:p>
@@ -702,30 +702,7 @@
         <w:jc w:val="both"/>
       </w:pPr>
       <w:r>
-        <w:rPr>
-          <w:rFonts w:ascii="Times New Roman" w:cs="Times New Roman" w:eastAsia="Times New Roman" w:hAnsi="Times New Roman"/>
-          <w:sz w:val="26"/>
-          <w:szCs w:val="26"/>
-        </w:rPr>
-        <w:t xml:space="preserve">☐ </w:t>
-      </w:r>
-      <w:r>
-        <w:rPr>
-          <w:rFonts w:ascii="Times New Roman" w:cs="Times New Roman" w:eastAsia="Times New Roman" w:hAnsi="Times New Roman"/>
-          <w:b/>
-          <w:bCs/>
-          <w:sz w:val="26"/>
-          <w:szCs w:val="26"/>
-        </w:rPr>
-        <w:t xml:space="preserve">Phương án A:</w:t>
-      </w:r>
-      <w:r>
-        <w:rPr>
-          <w:rFonts w:ascii="Times New Roman" w:cs="Times New Roman" w:eastAsia="Times New Roman" w:hAnsi="Times New Roman"/>
-          <w:sz w:val="26"/>
-          <w:szCs w:val="26"/>
-        </w:rPr>
-        <w:t xml:space="preserve"> Giá cố định trong suốt thời hạn hợp đồng.</w:t>
+        <w:t xml:space="preserve">{#pa_1_a}</w:t>
       </w:r>
     </w:p>
     <w:p>
@@ -744,7 +721,7 @@
           <w:sz w:val="26"/>
           <w:szCs w:val="26"/>
         </w:rPr>
-        <w:t xml:space="preserve">☐ </w:t>
+        <w:t xml:space="preserve">{pa_1_a_o} </w:t>
       </w:r>
       <w:r>
         <w:rPr>
@@ -754,15 +731,15 @@
           <w:sz w:val="26"/>
           <w:szCs w:val="26"/>
         </w:rPr>
-        <w:t xml:space="preserve">Phương án B:</w:t>
-      </w:r>
-      <w:r>
-        <w:rPr>
-          <w:rFonts w:ascii="Times New Roman" w:cs="Times New Roman" w:eastAsia="Times New Roman" w:hAnsi="Times New Roman"/>
-          <w:sz w:val="26"/>
-          <w:szCs w:val="26"/>
-        </w:rPr>
-        <w:t xml:space="preserve"> Giá cố định cho từng Đơn đặt hàng đã xác nhận. Khi giá thị trường biến động, Bên B gửi thông báo giá mới trước ít nhất …… (mặc định: 07) ngày; giá mới chỉ áp dụng cho Đơn đặt hàng gửi sau ngày hiệu lực của thông báo và khi Bên A chấp thuận bằng văn bản.</w:t>
+        <w:t xml:space="preserve">Phương án A:</w:t>
+      </w:r>
+      <w:r>
+        <w:rPr>
+          <w:rFonts w:ascii="Times New Roman" w:cs="Times New Roman" w:eastAsia="Times New Roman" w:hAnsi="Times New Roman"/>
+          <w:sz w:val="26"/>
+          <w:szCs w:val="26"/>
+        </w:rPr>
+        <w:t xml:space="preserve"> Giá cố định trong suốt thời hạn hợp đồng.</w:t>
       </w:r>
     </w:p>
     <w:p>
@@ -776,196 +753,7 @@
         <w:jc w:val="both"/>
       </w:pPr>
       <w:r>
-        <w:rPr>
-          <w:rFonts w:ascii="Times New Roman" w:cs="Times New Roman" w:eastAsia="Times New Roman" w:hAnsi="Times New Roman"/>
-          <w:sz w:val="26"/>
-          <w:szCs w:val="26"/>
-        </w:rPr>
-        <w:t xml:space="preserve">☐ </w:t>
-      </w:r>
-      <w:r>
-        <w:rPr>
-          <w:rFonts w:ascii="Times New Roman" w:cs="Times New Roman" w:eastAsia="Times New Roman" w:hAnsi="Times New Roman"/>
-          <w:b/>
-          <w:bCs/>
-          <w:sz w:val="26"/>
-          <w:szCs w:val="26"/>
-        </w:rPr>
-        <w:t xml:space="preserve">Phương án C:</w:t>
-      </w:r>
-      <w:r>
-        <w:rPr>
-          <w:rFonts w:ascii="Times New Roman" w:cs="Times New Roman" w:eastAsia="Times New Roman" w:hAnsi="Times New Roman"/>
-          <w:sz w:val="26"/>
-          <w:szCs w:val="26"/>
-        </w:rPr>
-        <w:t xml:space="preserve"> Giá điều chỉnh theo giá niêm yết của nhà sản xuất ……… tại ngày giao hàng, chiết khấu …… %.</w:t>
-      </w:r>
-    </w:p>
-    <w:p>
-      <w:pPr>
-        <w:spacing w:after="80" w:before="40" w:line="288"/>
-        <w:jc w:val="both"/>
-      </w:pPr>
-      <w:r>
-        <w:rPr>
-          <w:rFonts w:ascii="Times New Roman" w:cs="Times New Roman" w:eastAsia="Times New Roman" w:hAnsi="Times New Roman"/>
-          <w:sz w:val="26"/>
-          <w:szCs w:val="26"/>
-        </w:rPr>
-        <w:t xml:space="preserve">2.3. Bên B cam kết giá bán cho Bên A không cao hơn giá bán cho khách hàng khác có cùng điều kiện mua hàng.</w:t>
-      </w:r>
-    </w:p>
-    <w:p>
-      <w:pPr>
-        <w:pStyle w:val="Heading2"/>
-        <w:keepNext/>
-        <w:spacing w:after="80" w:before="200" w:line="288"/>
-        <w:jc w:val="both"/>
-      </w:pPr>
-      <w:r>
-        <w:rPr>
-          <w:rFonts w:ascii="Times New Roman" w:cs="Times New Roman" w:eastAsia="Times New Roman" w:hAnsi="Times New Roman"/>
-          <w:b/>
-          <w:bCs/>
-          <w:sz w:val="26"/>
-          <w:szCs w:val="26"/>
-        </w:rPr>
-        <w:t xml:space="preserve">Điều 3. Giao hàng</w:t>
-      </w:r>
-    </w:p>
-    <w:p>
-      <w:pPr>
-        <w:spacing w:after="80" w:before="40" w:line="288"/>
-        <w:jc w:val="both"/>
-      </w:pPr>
-      <w:r>
-        <w:rPr>
-          <w:rFonts w:ascii="Times New Roman" w:cs="Times New Roman" w:eastAsia="Times New Roman" w:hAnsi="Times New Roman"/>
-          <w:sz w:val="26"/>
-          <w:szCs w:val="26"/>
-        </w:rPr>
-        <w:t xml:space="preserve">3.1. Địa điểm giao hàng: công trình của Bên A theo địa chỉ ghi trên Đơn đặt hàng. Thời gian giao: theo Đơn đặt hàng; Bên B thông báo trước khi xe xuất phát.</w:t>
-      </w:r>
-    </w:p>
-    <w:p>
-      <w:pPr>
-        <w:spacing w:after="80" w:before="40" w:line="288"/>
-        <w:jc w:val="both"/>
-      </w:pPr>
-      <w:r>
-        <w:rPr>
-          <w:rFonts w:ascii="Times New Roman" w:cs="Times New Roman" w:eastAsia="Times New Roman" w:hAnsi="Times New Roman"/>
-          <w:sz w:val="26"/>
-          <w:szCs w:val="26"/>
-        </w:rPr>
-        <w:t xml:space="preserve">3.2. Mỗi lần giao hàng kèm: phiếu giao hàng/phiếu xuất kho ghi rõ số Đơn đặt hàng; CO/CQ hoặc chứng chỉ chất lượng của lô hàng; phiếu giao bê tông ghi giờ xuất trạm, mác, độ sụt (đối với bê tông thương phẩm); phiếu cân (đối với hàng tính theo khối lượng).</w:t>
-      </w:r>
-    </w:p>
-    <w:p>
-      <w:pPr>
-        <w:spacing w:after="80" w:before="40" w:line="288"/>
-        <w:jc w:val="both"/>
-      </w:pPr>
-      <w:r>
-        <w:rPr>
-          <w:rFonts w:ascii="Times New Roman" w:cs="Times New Roman" w:eastAsia="Times New Roman" w:hAnsi="Times New Roman"/>
-          <w:sz w:val="26"/>
-          <w:szCs w:val="26"/>
-        </w:rPr>
-        <w:t xml:space="preserve">3.3. Giao chậm quá …… giờ/ngày so với Đơn đặt hàng mà không được Bên A chấp thuận, Bên A có quyền từ chối nhận hàng và mua của nhà cung cấp khác; Bên B chịu phần chênh lệch giá (nếu có).</w:t>
-      </w:r>
-    </w:p>
-    <w:p>
-      <w:pPr>
-        <w:pStyle w:val="Heading2"/>
-        <w:keepNext/>
-        <w:spacing w:after="80" w:before="200" w:line="288"/>
-        <w:jc w:val="both"/>
-      </w:pPr>
-      <w:r>
-        <w:rPr>
-          <w:rFonts w:ascii="Times New Roman" w:cs="Times New Roman" w:eastAsia="Times New Roman" w:hAnsi="Times New Roman"/>
-          <w:b/>
-          <w:bCs/>
-          <w:sz w:val="26"/>
-          <w:szCs w:val="26"/>
-        </w:rPr>
-        <w:t xml:space="preserve">Điều 4. Kiểm tra, nghiệm thu chất lượng</w:t>
-      </w:r>
-    </w:p>
-    <w:p>
-      <w:pPr>
-        <w:spacing w:after="80" w:before="40" w:line="288"/>
-        <w:jc w:val="both"/>
-      </w:pPr>
-      <w:r>
-        <w:rPr>
-          <w:rFonts w:ascii="Times New Roman" w:cs="Times New Roman" w:eastAsia="Times New Roman" w:hAnsi="Times New Roman"/>
-          <w:sz w:val="26"/>
-          <w:szCs w:val="26"/>
-        </w:rPr>
-        <w:t xml:space="preserve">4.1. Bên A kiểm tra số lượng (cân, đếm, đo) và chất lượng tại nơi giao nhận, lập biên bản giao nhận theo mẫu NVC-DC-02.</w:t>
-      </w:r>
-    </w:p>
-    <w:p>
-      <w:pPr>
-        <w:spacing w:after="80" w:before="40" w:line="288"/>
-        <w:jc w:val="both"/>
-      </w:pPr>
-      <w:r>
-        <w:rPr>
-          <w:rFonts w:ascii="Times New Roman" w:cs="Times New Roman" w:eastAsia="Times New Roman" w:hAnsi="Times New Roman"/>
-          <w:sz w:val="26"/>
-          <w:szCs w:val="26"/>
-        </w:rPr>
-        <w:t xml:space="preserve">4.2. Đối với bê tông thương phẩm: kiểm tra độ sụt tại hiện trường mỗi xe; lấy mẫu nén theo tiêu chuẩn với sự chứng kiến của hai bên; kết quả nén 28 ngày không đạt mác thiết kế thì Bên B chịu chi phí kiểm định, gia cố hoặc phá dỡ, làm lại và bồi thường thiệt hại phát sinh. Đối với thép, xi măng: lấy mẫu thí nghiệm theo lô theo yêu cầu của chủ đầu tư/tư vấn giám sát.</w:t>
-      </w:r>
-    </w:p>
-    <w:p>
-      <w:pPr>
-        <w:spacing w:after="80" w:before="40" w:line="288"/>
-        <w:jc w:val="both"/>
-      </w:pPr>
-      <w:r>
-        <w:rPr>
-          <w:rFonts w:ascii="Times New Roman" w:cs="Times New Roman" w:eastAsia="Times New Roman" w:hAnsi="Times New Roman"/>
-          <w:sz w:val="26"/>
-          <w:szCs w:val="26"/>
-        </w:rPr>
-        <w:t xml:space="preserve">4.3. Hàng không đạt chất lượng, sai quy cách: Bên A có quyền trả lại; Bên B đổi hàng trong vòng …… ngày và chịu chi phí vận chuyển. Khuyết tật ẩn phát hiện trong vòng …… tháng kể từ ngày giao vẫn thuộc trách nhiệm của Bên B.</w:t>
-      </w:r>
-    </w:p>
-    <w:p>
-      <w:pPr>
-        <w:pStyle w:val="Heading2"/>
-        <w:keepNext/>
-        <w:spacing w:after="80" w:before="200" w:line="288"/>
-        <w:jc w:val="both"/>
-      </w:pPr>
-      <w:r>
-        <w:rPr>
-          <w:rFonts w:ascii="Times New Roman" w:cs="Times New Roman" w:eastAsia="Times New Roman" w:hAnsi="Times New Roman"/>
-          <w:b/>
-          <w:bCs/>
-          <w:sz w:val="26"/>
-          <w:szCs w:val="26"/>
-        </w:rPr>
-        <w:t xml:space="preserve">Điều 5. Thanh toán và công nợ</w:t>
-      </w:r>
-    </w:p>
-    <w:p>
-      <w:pPr>
-        <w:spacing w:after="80" w:before="40" w:line="288"/>
-        <w:jc w:val="both"/>
-      </w:pPr>
-      <w:r>
-        <w:rPr>
-          <w:rFonts w:ascii="Times New Roman" w:cs="Times New Roman" w:eastAsia="Times New Roman" w:hAnsi="Times New Roman"/>
-          <w:sz w:val="26"/>
-          <w:szCs w:val="26"/>
-        </w:rPr>
-        <w:t xml:space="preserve">5.1. Phương thức: chuyển khoản. Thời hạn:</w:t>
+        <w:t xml:space="preserve">{/pa_1_a}</w:t>
       </w:r>
     </w:p>
     <w:p>
@@ -979,30 +767,7 @@
         <w:jc w:val="both"/>
       </w:pPr>
       <w:r>
-        <w:rPr>
-          <w:rFonts w:ascii="Times New Roman" w:cs="Times New Roman" w:eastAsia="Times New Roman" w:hAnsi="Times New Roman"/>
-          <w:sz w:val="26"/>
-          <w:szCs w:val="26"/>
-        </w:rPr>
-        <w:t xml:space="preserve">☐ </w:t>
-      </w:r>
-      <w:r>
-        <w:rPr>
-          <w:rFonts w:ascii="Times New Roman" w:cs="Times New Roman" w:eastAsia="Times New Roman" w:hAnsi="Times New Roman"/>
-          <w:b/>
-          <w:bCs/>
-          <w:sz w:val="26"/>
-          <w:szCs w:val="26"/>
-        </w:rPr>
-        <w:t xml:space="preserve">Phương án A:</w:t>
-      </w:r>
-      <w:r>
-        <w:rPr>
-          <w:rFonts w:ascii="Times New Roman" w:cs="Times New Roman" w:eastAsia="Times New Roman" w:hAnsi="Times New Roman"/>
-          <w:sz w:val="26"/>
-          <w:szCs w:val="26"/>
-        </w:rPr>
-        <w:t xml:space="preserve"> Thanh toán trong vòng …… (mặc định: 30) ngày kể từ ngày nhận hàng và hóa đơn hợp lệ.</w:t>
+        <w:t xml:space="preserve">{#pa_1_b}</w:t>
       </w:r>
     </w:p>
     <w:p>
@@ -1021,7 +786,7 @@
           <w:sz w:val="26"/>
           <w:szCs w:val="26"/>
         </w:rPr>
-        <w:t xml:space="preserve">☐ </w:t>
+        <w:t xml:space="preserve">{pa_1_b_o} </w:t>
       </w:r>
       <w:r>
         <w:rPr>
@@ -1039,339 +804,7 @@
           <w:sz w:val="26"/>
           <w:szCs w:val="26"/>
         </w:rPr>
-        <w:t xml:space="preserve"> Đối chiếu công nợ hằng tháng; thanh toán toàn bộ công nợ của tháng trước trước ngày …… của tháng sau.</w:t>
-      </w:r>
-    </w:p>
-    <w:p>
-      <w:pPr>
-        <w:spacing w:after="80" w:before="40" w:line="288"/>
-        <w:jc w:val="both"/>
-      </w:pPr>
-      <w:r>
-        <w:rPr>
-          <w:rFonts w:ascii="Times New Roman" w:cs="Times New Roman" w:eastAsia="Times New Roman" w:hAnsi="Times New Roman"/>
-          <w:sz w:val="26"/>
-          <w:szCs w:val="26"/>
-        </w:rPr>
-        <w:t xml:space="preserve">5.2. Hạn mức công nợ Bên B dành cho Bên A: ……………… đồng.</w:t>
-      </w:r>
-    </w:p>
-    <w:p>
-      <w:pPr>
-        <w:spacing w:after="80" w:before="40" w:line="288"/>
-        <w:jc w:val="both"/>
-      </w:pPr>
-      <w:r>
-        <w:rPr>
-          <w:rFonts w:ascii="Times New Roman" w:cs="Times New Roman" w:eastAsia="Times New Roman" w:hAnsi="Times New Roman"/>
-          <w:sz w:val="26"/>
-          <w:szCs w:val="26"/>
-        </w:rPr>
-        <w:t xml:space="preserve">5.3. Trước ngày …… hằng tháng, hai bên ký </w:t>
-      </w:r>
-      <w:r>
-        <w:rPr>
-          <w:rFonts w:ascii="Times New Roman" w:cs="Times New Roman" w:eastAsia="Times New Roman" w:hAnsi="Times New Roman"/>
-          <w:b/>
-          <w:bCs/>
-          <w:sz w:val="26"/>
-          <w:szCs w:val="26"/>
-        </w:rPr>
-        <w:t xml:space="preserve">biên bản đối chiếu công nợ</w:t>
-      </w:r>
-      <w:r>
-        <w:rPr>
-          <w:rFonts w:ascii="Times New Roman" w:cs="Times New Roman" w:eastAsia="Times New Roman" w:hAnsi="Times New Roman"/>
-          <w:sz w:val="26"/>
-          <w:szCs w:val="26"/>
-        </w:rPr>
-        <w:t xml:space="preserve">. Quá …… ngày kể từ ngày nhận mà Bên A không có ý kiến thì số liệu do Bên B gửi được coi là đã xác nhận.</w:t>
-      </w:r>
-    </w:p>
-    <w:p>
-      <w:pPr>
-        <w:spacing w:after="80" w:before="40" w:line="288"/>
-        <w:jc w:val="both"/>
-      </w:pPr>
-      <w:r>
-        <w:rPr>
-          <w:rFonts w:ascii="Times New Roman" w:cs="Times New Roman" w:eastAsia="Times New Roman" w:hAnsi="Times New Roman"/>
-          <w:sz w:val="26"/>
-          <w:szCs w:val="26"/>
-        </w:rPr>
-        <w:t xml:space="preserve">5.4. Hóa đơn: Bên B xuất hóa đơn điện tử theo từng lần giao hàng [hoặc tổng hợp theo tháng nếu pháp luật cho phép], ghi đúng tên, mã số thuế của Bên A và tên công trình.</w:t>
-      </w:r>
-    </w:p>
-    <w:p>
-      <w:pPr>
-        <w:pStyle w:val="Heading2"/>
-        <w:keepNext/>
-        <w:spacing w:after="80" w:before="200" w:line="288"/>
-        <w:jc w:val="both"/>
-      </w:pPr>
-      <w:r>
-        <w:rPr>
-          <w:rFonts w:ascii="Times New Roman" w:cs="Times New Roman" w:eastAsia="Times New Roman" w:hAnsi="Times New Roman"/>
-          <w:b/>
-          <w:bCs/>
-          <w:sz w:val="26"/>
-          <w:szCs w:val="26"/>
-        </w:rPr>
-        <w:t xml:space="preserve">Điều 6. Phạt vi phạm và bồi thường</w:t>
-      </w:r>
-    </w:p>
-    <w:p>
-      <w:pPr>
-        <w:spacing w:after="80" w:before="40" w:line="288"/>
-        <w:jc w:val="both"/>
-      </w:pPr>
-      <w:r>
-        <w:rPr>
-          <w:rFonts w:ascii="Times New Roman" w:cs="Times New Roman" w:eastAsia="Times New Roman" w:hAnsi="Times New Roman"/>
-          <w:sz w:val="26"/>
-          <w:szCs w:val="26"/>
-        </w:rPr>
-        <w:t xml:space="preserve">6.1. Bên vi phạm nghĩa vụ chịu phạt …… % giá trị phần nghĩa vụ bị vi phạm (tối đa 8% theo Luật Thương mại) và bồi thường thiệt hại thực tế phát sinh.</w:t>
-      </w:r>
-    </w:p>
-    <w:p>
-      <w:pPr>
-        <w:spacing w:after="80" w:before="40" w:line="288"/>
-        <w:jc w:val="both"/>
-      </w:pPr>
-      <w:r>
-        <w:rPr>
-          <w:rFonts w:ascii="Times New Roman" w:cs="Times New Roman" w:eastAsia="Times New Roman" w:hAnsi="Times New Roman"/>
-          <w:sz w:val="26"/>
-          <w:szCs w:val="26"/>
-        </w:rPr>
-        <w:t xml:space="preserve">6.2. Bên A chậm thanh toán chịu lãi chậm trả …… %/năm trên số tiền chậm trả.</w:t>
-      </w:r>
-    </w:p>
-    <w:p>
-      <w:pPr>
-        <w:pStyle w:val="Heading2"/>
-        <w:keepNext/>
-        <w:spacing w:after="80" w:before="200" w:line="288"/>
-        <w:jc w:val="both"/>
-      </w:pPr>
-      <w:r>
-        <w:rPr>
-          <w:rFonts w:ascii="Times New Roman" w:cs="Times New Roman" w:eastAsia="Times New Roman" w:hAnsi="Times New Roman"/>
-          <w:b/>
-          <w:bCs/>
-          <w:sz w:val="26"/>
-          <w:szCs w:val="26"/>
-        </w:rPr>
-        <w:t xml:space="preserve">Điều 7. Liêm chính trong giao dịch</w:t>
-      </w:r>
-    </w:p>
-    <w:p>
-      <w:pPr>
-        <w:spacing w:after="80" w:before="40" w:line="288"/>
-        <w:jc w:val="both"/>
-      </w:pPr>
-      <w:r>
-        <w:rPr>
-          <w:rFonts w:ascii="Times New Roman" w:cs="Times New Roman" w:eastAsia="Times New Roman" w:hAnsi="Times New Roman"/>
-          <w:sz w:val="26"/>
-          <w:szCs w:val="26"/>
-        </w:rPr>
-        <w:t xml:space="preserve">7.1. Bên B không đưa, hứa đưa tiền, quà tặng, hoa hồng hoặc lợi ích khác cho nhân viên của Bên A (mua hàng, thủ kho, chỉ huy công trường …) nhằm được chọn mua hàng, nhận hàng không đạt hoặc ký xác nhận sai số lượng.</w:t>
-      </w:r>
-    </w:p>
-    <w:p>
-      <w:pPr>
-        <w:spacing w:after="80" w:before="40" w:line="288"/>
-        <w:jc w:val="both"/>
-      </w:pPr>
-      <w:r>
-        <w:rPr>
-          <w:rFonts w:ascii="Times New Roman" w:cs="Times New Roman" w:eastAsia="Times New Roman" w:hAnsi="Times New Roman"/>
-          <w:sz w:val="26"/>
-          <w:szCs w:val="26"/>
-        </w:rPr>
-        <w:t xml:space="preserve">7.2. Vi phạm Điều này, Bên A có quyền chấm dứt Hợp đồng ngay mà không phải bồi thường, đồng thời yêu cầu Bên B bồi thường thiệt hại. Bên B báo cáo hành vi gợi ý, đòi hỏi lợi ích của nhân viên Bên A tới đường dây: ……………………</w:t>
-      </w:r>
-    </w:p>
-    <w:p>
-      <w:pPr>
-        <w:pStyle w:val="Heading2"/>
-        <w:keepNext/>
-        <w:spacing w:after="80" w:before="200" w:line="288"/>
-        <w:jc w:val="both"/>
-      </w:pPr>
-      <w:r>
-        <w:rPr>
-          <w:rFonts w:ascii="Times New Roman" w:cs="Times New Roman" w:eastAsia="Times New Roman" w:hAnsi="Times New Roman"/>
-          <w:b/>
-          <w:bCs/>
-          <w:sz w:val="26"/>
-          <w:szCs w:val="26"/>
-        </w:rPr>
-        <w:t xml:space="preserve">Điều 8. Thời hạn và chấm dứt</w:t>
-      </w:r>
-    </w:p>
-    <w:p>
-      <w:pPr>
-        <w:spacing w:after="80" w:before="40" w:line="288"/>
-        <w:jc w:val="both"/>
-      </w:pPr>
-      <w:r>
-        <w:rPr>
-          <w:rFonts w:ascii="Times New Roman" w:cs="Times New Roman" w:eastAsia="Times New Roman" w:hAnsi="Times New Roman"/>
-          <w:sz w:val="26"/>
-          <w:szCs w:val="26"/>
-        </w:rPr>
-        <w:t xml:space="preserve">8.1. Hợp đồng có thời hạn 12 tháng kể từ ngày ký; tự động gia hạn thêm từng 12 tháng nếu không bên nào thông báo chấm dứt trước …… ngày.</w:t>
-      </w:r>
-    </w:p>
-    <w:p>
-      <w:pPr>
-        <w:spacing w:after="80" w:before="40" w:line="288"/>
-        <w:jc w:val="both"/>
-      </w:pPr>
-      <w:r>
-        <w:rPr>
-          <w:rFonts w:ascii="Times New Roman" w:cs="Times New Roman" w:eastAsia="Times New Roman" w:hAnsi="Times New Roman"/>
-          <w:sz w:val="26"/>
-          <w:szCs w:val="26"/>
-        </w:rPr>
-        <w:t xml:space="preserve">8.2. Mỗi bên có quyền chấm dứt Hợp đồng bằng thông báo trước …… ngày; các Đơn đặt hàng đã xác nhận vẫn phải thực hiện xong.</w:t>
-      </w:r>
-    </w:p>
-    <w:p>
-      <w:pPr>
-        <w:pStyle w:val="Heading2"/>
-        <w:keepNext/>
-        <w:spacing w:after="80" w:before="200" w:line="288"/>
-        <w:jc w:val="both"/>
-      </w:pPr>
-      <w:r>
-        <w:rPr>
-          <w:rFonts w:ascii="Times New Roman" w:cs="Times New Roman" w:eastAsia="Times New Roman" w:hAnsi="Times New Roman"/>
-          <w:b/>
-          <w:bCs/>
-          <w:sz w:val="26"/>
-          <w:szCs w:val="26"/>
-        </w:rPr>
-        <w:t xml:space="preserve">Điều 9. Sự kiện bất khả kháng và hoàn cảnh thay đổi cơ bản</w:t>
-      </w:r>
-    </w:p>
-    <w:p>
-      <w:pPr>
-        <w:spacing w:after="80" w:before="40" w:line="288"/>
-        <w:jc w:val="both"/>
-      </w:pPr>
-      <w:r>
-        <w:rPr>
-          <w:rFonts w:ascii="Times New Roman" w:cs="Times New Roman" w:eastAsia="Times New Roman" w:hAnsi="Times New Roman"/>
-          <w:sz w:val="26"/>
-          <w:szCs w:val="26"/>
-        </w:rPr>
-        <w:t xml:space="preserve">9.1. Sự kiện bất khả kháng là sự kiện xảy ra khách quan, không thể lường trước và không thể khắc phục được mặc dù đã áp dụng mọi biện pháp cần thiết trong khả năng cho phép, gồm: thiên tai, hỏa hoạn không do lỗi của các bên, dịch bệnh được cơ quan có thẩm quyền công bố, chiến tranh, bạo loạn, quyết định của cơ quan nhà nước có thẩm quyền làm ngưng trệ việc thực hiện hợp đồng và các trường hợp khác theo quy định của pháp luật.</w:t>
-      </w:r>
-    </w:p>
-    <w:p>
-      <w:pPr>
-        <w:spacing w:after="80" w:before="40" w:line="288"/>
-        <w:jc w:val="both"/>
-      </w:pPr>
-      <w:r>
-        <w:rPr>
-          <w:rFonts w:ascii="Times New Roman" w:cs="Times New Roman" w:eastAsia="Times New Roman" w:hAnsi="Times New Roman"/>
-          <w:sz w:val="26"/>
-          <w:szCs w:val="26"/>
-        </w:rPr>
-        <w:t xml:space="preserve">9.2. Bên gặp sự kiện bất khả kháng phải thông báo bằng văn bản cho bên kia trong vòng 03 (ba) ngày làm việc kể từ khi sự kiện xảy ra, kèm bằng chứng hợp lý, và áp dụng mọi biện pháp để hạn chế thiệt hại.</w:t>
-      </w:r>
-    </w:p>
-    <w:p>
-      <w:pPr>
-        <w:spacing w:after="80" w:before="40" w:line="288"/>
-        <w:jc w:val="both"/>
-      </w:pPr>
-      <w:r>
-        <w:rPr>
-          <w:rFonts w:ascii="Times New Roman" w:cs="Times New Roman" w:eastAsia="Times New Roman" w:hAnsi="Times New Roman"/>
-          <w:sz w:val="26"/>
-          <w:szCs w:val="26"/>
-        </w:rPr>
-        <w:t xml:space="preserve">9.3. Thời gian bị ảnh hưởng bởi sự kiện bất khả kháng không tính vào thời hạn thực hiện hợp đồng. Không bên nào bị phạt hoặc phải bồi thường do không thực hiện nghĩa vụ vì sự kiện bất khả kháng.</w:t>
-      </w:r>
-    </w:p>
-    <w:p>
-      <w:pPr>
-        <w:spacing w:after="80" w:before="40" w:line="288"/>
-        <w:jc w:val="both"/>
-      </w:pPr>
-      <w:r>
-        <w:rPr>
-          <w:rFonts w:ascii="Times New Roman" w:cs="Times New Roman" w:eastAsia="Times New Roman" w:hAnsi="Times New Roman"/>
-          <w:sz w:val="26"/>
-          <w:szCs w:val="26"/>
-        </w:rPr>
-        <w:t xml:space="preserve">9.4. Nếu sự kiện bất khả kháng kéo dài quá …… (mặc định: 60) ngày liên tục, mỗi bên có quyền chấm dứt hợp đồng bằng văn bản; các bên thanh toán cho nhau phần công việc, hàng hóa đã thực hiện và được nghiệm thu đến thời điểm chấm dứt.</w:t>
-      </w:r>
-    </w:p>
-    <w:p>
-      <w:pPr>
-        <w:spacing w:after="80" w:before="40" w:line="288"/>
-        <w:jc w:val="both"/>
-      </w:pPr>
-      <w:r>
-        <w:rPr>
-          <w:rFonts w:ascii="Times New Roman" w:cs="Times New Roman" w:eastAsia="Times New Roman" w:hAnsi="Times New Roman"/>
-          <w:sz w:val="26"/>
-          <w:szCs w:val="26"/>
-        </w:rPr>
-        <w:t xml:space="preserve">9.5. Khi hoàn cảnh thay đổi cơ bản theo Điều 420 Bộ luật Dân sự (ví dụ: giá vật liệu chính biến động bất thường vượt quá …… % so với thời điểm ký), bên bị ảnh hưởng có quyền đề nghị đàm phán lại phần giá và tiến độ liên quan trong thời hạn hợp lý.</w:t>
-      </w:r>
-    </w:p>
-    <w:p>
-      <w:pPr>
-        <w:pStyle w:val="Heading2"/>
-        <w:keepNext/>
-        <w:spacing w:after="80" w:before="200" w:line="288"/>
-        <w:jc w:val="both"/>
-      </w:pPr>
-      <w:r>
-        <w:rPr>
-          <w:rFonts w:ascii="Times New Roman" w:cs="Times New Roman" w:eastAsia="Times New Roman" w:hAnsi="Times New Roman"/>
-          <w:b/>
-          <w:bCs/>
-          <w:sz w:val="26"/>
-          <w:szCs w:val="26"/>
-        </w:rPr>
-        <w:t xml:space="preserve">Điều 10. Giải quyết tranh chấp</w:t>
-      </w:r>
-    </w:p>
-    <w:p>
-      <w:pPr>
-        <w:spacing w:after="80" w:before="40" w:line="288"/>
-        <w:jc w:val="both"/>
-      </w:pPr>
-      <w:r>
-        <w:rPr>
-          <w:rFonts w:ascii="Times New Roman" w:cs="Times New Roman" w:eastAsia="Times New Roman" w:hAnsi="Times New Roman"/>
-          <w:sz w:val="26"/>
-          <w:szCs w:val="26"/>
-        </w:rPr>
-        <w:t xml:space="preserve">10.1. Khi phát sinh tranh chấp, các bên ưu tiên thương lượng, hòa giải trên tinh thần thiện chí. Bên nhận được yêu cầu giải quyết phải trả lời bằng văn bản trong vòng 07 (bảy) ngày làm việc.</w:t>
-      </w:r>
-    </w:p>
-    <w:p>
-      <w:pPr>
-        <w:spacing w:after="80" w:before="40" w:line="288"/>
-        <w:jc w:val="both"/>
-      </w:pPr>
-      <w:r>
-        <w:rPr>
-          <w:rFonts w:ascii="Times New Roman" w:cs="Times New Roman" w:eastAsia="Times New Roman" w:hAnsi="Times New Roman"/>
-          <w:sz w:val="26"/>
-          <w:szCs w:val="26"/>
-        </w:rPr>
-        <w:t xml:space="preserve">10.2. Trường hợp thương lượng không thành trong vòng 30 (ba mươi) ngày kể từ ngày một bên gửi yêu cầu, tranh chấp được giải quyết theo phương án sau:</w:t>
+        <w:t xml:space="preserve"> Giá cố định cho từng Đơn đặt hàng đã xác nhận. Khi giá thị trường biến động, Bên B gửi thông báo giá mới trước ít nhất {o_10}  ngày; giá mới chỉ áp dụng cho Đơn đặt hàng gửi sau ngày hiệu lực của thông báo và khi Bên A chấp thuận bằng văn bản.</w:t>
       </w:r>
     </w:p>
     <w:p>
@@ -1385,30 +818,7 @@
         <w:jc w:val="both"/>
       </w:pPr>
       <w:r>
-        <w:rPr>
-          <w:rFonts w:ascii="Times New Roman" w:cs="Times New Roman" w:eastAsia="Times New Roman" w:hAnsi="Times New Roman"/>
-          <w:sz w:val="26"/>
-          <w:szCs w:val="26"/>
-        </w:rPr>
-        <w:t xml:space="preserve">☐ </w:t>
-      </w:r>
-      <w:r>
-        <w:rPr>
-          <w:rFonts w:ascii="Times New Roman" w:cs="Times New Roman" w:eastAsia="Times New Roman" w:hAnsi="Times New Roman"/>
-          <w:b/>
-          <w:bCs/>
-          <w:sz w:val="26"/>
-          <w:szCs w:val="26"/>
-        </w:rPr>
-        <w:t xml:space="preserve">Phương án A:</w:t>
-      </w:r>
-      <w:r>
-        <w:rPr>
-          <w:rFonts w:ascii="Times New Roman" w:cs="Times New Roman" w:eastAsia="Times New Roman" w:hAnsi="Times New Roman"/>
-          <w:sz w:val="26"/>
-          <w:szCs w:val="26"/>
-        </w:rPr>
-        <w:t xml:space="preserve"> Tòa án nhân dân có thẩm quyền theo quy định của pháp luật tố tụng dân sự giải quyết theo quy định của pháp luật Việt Nam.</w:t>
+        <w:t xml:space="preserve">{/pa_1_b}</w:t>
       </w:r>
     </w:p>
     <w:p>
@@ -1422,12 +832,26 @@
         <w:jc w:val="both"/>
       </w:pPr>
       <w:r>
-        <w:rPr>
-          <w:rFonts w:ascii="Times New Roman" w:cs="Times New Roman" w:eastAsia="Times New Roman" w:hAnsi="Times New Roman"/>
-          <w:sz w:val="26"/>
-          <w:szCs w:val="26"/>
-        </w:rPr>
-        <w:t xml:space="preserve">☐ </w:t>
+        <w:t xml:space="preserve">{#pa_1_c}</w:t>
+      </w:r>
+    </w:p>
+    <w:p>
+      <w:pPr>
+        <w:pBdr>
+          <w:left w:val="single" w:color="4F81BD" w:sz="18" w:space="6"/>
+        </w:pBdr>
+        <w:shd w:fill="EAF1FB" w:color="auto" w:val="clear"/>
+        <w:spacing w:after="40" w:before="20" w:line="288"/>
+        <w:ind w:left="360"/>
+        <w:jc w:val="both"/>
+      </w:pPr>
+      <w:r>
+        <w:rPr>
+          <w:rFonts w:ascii="Times New Roman" w:cs="Times New Roman" w:eastAsia="Times New Roman" w:hAnsi="Times New Roman"/>
+          <w:sz w:val="26"/>
+          <w:szCs w:val="26"/>
+        </w:rPr>
+        <w:t xml:space="preserve">{pa_1_c_o} </w:t>
       </w:r>
       <w:r>
         <w:rPr>
@@ -1437,15 +861,29 @@
           <w:sz w:val="26"/>
           <w:szCs w:val="26"/>
         </w:rPr>
-        <w:t xml:space="preserve">Phương án B:</w:t>
-      </w:r>
-      <w:r>
-        <w:rPr>
-          <w:rFonts w:ascii="Times New Roman" w:cs="Times New Roman" w:eastAsia="Times New Roman" w:hAnsi="Times New Roman"/>
-          <w:sz w:val="26"/>
-          <w:szCs w:val="26"/>
-        </w:rPr>
-        <w:t xml:space="preserve"> Trung tâm Trọng tài Quốc tế Việt Nam (VIAC) giải quyết theo Quy tắc tố tụng trọng tài của Trung tâm này; phán quyết trọng tài là chung thẩm. Số trọng tài viên: 01; địa điểm: Hà Nội; ngôn ngữ: tiếng Việt.</w:t>
+        <w:t xml:space="preserve">Phương án C:</w:t>
+      </w:r>
+      <w:r>
+        <w:rPr>
+          <w:rFonts w:ascii="Times New Roman" w:cs="Times New Roman" w:eastAsia="Times New Roman" w:hAnsi="Times New Roman"/>
+          <w:sz w:val="26"/>
+          <w:szCs w:val="26"/>
+        </w:rPr>
+        <w:t xml:space="preserve"> Giá điều chỉnh theo giá niêm yết của nhà sản xuất {o_11} tại ngày giao hàng, chiết khấu {o_12} %.</w:t>
+      </w:r>
+    </w:p>
+    <w:p>
+      <w:pPr>
+        <w:pBdr>
+          <w:left w:val="single" w:color="4F81BD" w:sz="18" w:space="6"/>
+        </w:pBdr>
+        <w:shd w:fill="EAF1FB" w:color="auto" w:val="clear"/>
+        <w:spacing w:after="40" w:before="20" w:line="288"/>
+        <w:ind w:left="360"/>
+        <w:jc w:val="both"/>
+      </w:pPr>
+      <w:r>
+        <w:t xml:space="preserve">{/pa_1_c}</w:t>
       </w:r>
     </w:p>
     <w:p>
@@ -1459,7 +897,7 @@
           <w:sz w:val="26"/>
           <w:szCs w:val="26"/>
         </w:rPr>
-        <w:t xml:space="preserve">10.3. Trong thời gian giải quyết tranh chấp, các bên tiếp tục thực hiện các nghĩa vụ không bị tranh chấp, trừ khi hợp đồng đã chấm dứt.</w:t>
+        <w:t xml:space="preserve">2.3. Bên B cam kết giá bán cho Bên A không cao hơn giá bán cho khách hàng khác có cùng điều kiện mua hàng.</w:t>
       </w:r>
     </w:p>
     <w:p>
@@ -1477,6 +915,764 @@
           <w:sz w:val="26"/>
           <w:szCs w:val="26"/>
         </w:rPr>
+        <w:t xml:space="preserve">Điều 3. Giao hàng</w:t>
+      </w:r>
+    </w:p>
+    <w:p>
+      <w:pPr>
+        <w:spacing w:after="80" w:before="40" w:line="288"/>
+        <w:jc w:val="both"/>
+      </w:pPr>
+      <w:r>
+        <w:rPr>
+          <w:rFonts w:ascii="Times New Roman" w:cs="Times New Roman" w:eastAsia="Times New Roman" w:hAnsi="Times New Roman"/>
+          <w:sz w:val="26"/>
+          <w:szCs w:val="26"/>
+        </w:rPr>
+        <w:t xml:space="preserve">3.1. Địa điểm giao hàng: công trình của Bên A theo địa chỉ ghi trên Đơn đặt hàng. Thời gian giao: theo Đơn đặt hàng; Bên B thông báo trước khi xe xuất phát.</w:t>
+      </w:r>
+    </w:p>
+    <w:p>
+      <w:pPr>
+        <w:spacing w:after="80" w:before="40" w:line="288"/>
+        <w:jc w:val="both"/>
+      </w:pPr>
+      <w:r>
+        <w:rPr>
+          <w:rFonts w:ascii="Times New Roman" w:cs="Times New Roman" w:eastAsia="Times New Roman" w:hAnsi="Times New Roman"/>
+          <w:sz w:val="26"/>
+          <w:szCs w:val="26"/>
+        </w:rPr>
+        <w:t xml:space="preserve">3.2. Mỗi lần giao hàng kèm: phiếu giao hàng/phiếu xuất kho ghi rõ số Đơn đặt hàng; CO/CQ hoặc chứng chỉ chất lượng của lô hàng; phiếu giao bê tông ghi giờ xuất trạm, mác, độ sụt (đối với bê tông thương phẩm); phiếu cân (đối với hàng tính theo khối lượng).</w:t>
+      </w:r>
+    </w:p>
+    <w:p>
+      <w:pPr>
+        <w:spacing w:after="80" w:before="40" w:line="288"/>
+        <w:jc w:val="both"/>
+      </w:pPr>
+      <w:r>
+        <w:rPr>
+          <w:rFonts w:ascii="Times New Roman" w:cs="Times New Roman" w:eastAsia="Times New Roman" w:hAnsi="Times New Roman"/>
+          <w:sz w:val="26"/>
+          <w:szCs w:val="26"/>
+        </w:rPr>
+        <w:t xml:space="preserve">3.3. Giao chậm quá {o_13} giờ/ngày so với Đơn đặt hàng mà không được Bên A chấp thuận, Bên A có quyền từ chối nhận hàng và mua của nhà cung cấp khác; Bên B chịu phần chênh lệch giá (nếu có).</w:t>
+      </w:r>
+    </w:p>
+    <w:p>
+      <w:pPr>
+        <w:pStyle w:val="Heading2"/>
+        <w:keepNext/>
+        <w:spacing w:after="80" w:before="200" w:line="288"/>
+        <w:jc w:val="both"/>
+      </w:pPr>
+      <w:r>
+        <w:rPr>
+          <w:rFonts w:ascii="Times New Roman" w:cs="Times New Roman" w:eastAsia="Times New Roman" w:hAnsi="Times New Roman"/>
+          <w:b/>
+          <w:bCs/>
+          <w:sz w:val="26"/>
+          <w:szCs w:val="26"/>
+        </w:rPr>
+        <w:t xml:space="preserve">Điều 4. Kiểm tra, nghiệm thu chất lượng</w:t>
+      </w:r>
+    </w:p>
+    <w:p>
+      <w:pPr>
+        <w:spacing w:after="80" w:before="40" w:line="288"/>
+        <w:jc w:val="both"/>
+      </w:pPr>
+      <w:r>
+        <w:rPr>
+          <w:rFonts w:ascii="Times New Roman" w:cs="Times New Roman" w:eastAsia="Times New Roman" w:hAnsi="Times New Roman"/>
+          <w:sz w:val="26"/>
+          <w:szCs w:val="26"/>
+        </w:rPr>
+        <w:t xml:space="preserve">4.1. Bên A kiểm tra số lượng (cân, đếm, đo) và chất lượng tại nơi giao nhận, lập biên bản giao nhận theo mẫu NVC-DC-02.</w:t>
+      </w:r>
+    </w:p>
+    <w:p>
+      <w:pPr>
+        <w:spacing w:after="80" w:before="40" w:line="288"/>
+        <w:jc w:val="both"/>
+      </w:pPr>
+      <w:r>
+        <w:rPr>
+          <w:rFonts w:ascii="Times New Roman" w:cs="Times New Roman" w:eastAsia="Times New Roman" w:hAnsi="Times New Roman"/>
+          <w:sz w:val="26"/>
+          <w:szCs w:val="26"/>
+        </w:rPr>
+        <w:t xml:space="preserve">4.2. Đối với bê tông thương phẩm: kiểm tra độ sụt tại hiện trường mỗi xe; lấy mẫu nén theo tiêu chuẩn với sự chứng kiến của hai bên; kết quả nén 28 ngày không đạt mác thiết kế thì Bên B chịu chi phí kiểm định, gia cố hoặc phá dỡ, làm lại và bồi thường thiệt hại phát sinh. Đối với thép, xi măng: lấy mẫu thí nghiệm theo lô theo yêu cầu của chủ đầu tư/tư vấn giám sát.</w:t>
+      </w:r>
+    </w:p>
+    <w:p>
+      <w:pPr>
+        <w:spacing w:after="80" w:before="40" w:line="288"/>
+        <w:jc w:val="both"/>
+      </w:pPr>
+      <w:r>
+        <w:rPr>
+          <w:rFonts w:ascii="Times New Roman" w:cs="Times New Roman" w:eastAsia="Times New Roman" w:hAnsi="Times New Roman"/>
+          <w:sz w:val="26"/>
+          <w:szCs w:val="26"/>
+        </w:rPr>
+        <w:t xml:space="preserve">4.3. Hàng không đạt chất lượng, sai quy cách: Bên A có quyền trả lại; Bên B đổi hàng trong vòng {o_14} ngày và chịu chi phí vận chuyển. Khuyết tật ẩn phát hiện trong vòng {o_15} tháng kể từ ngày giao vẫn thuộc trách nhiệm của Bên B.</w:t>
+      </w:r>
+    </w:p>
+    <w:p>
+      <w:pPr>
+        <w:pStyle w:val="Heading2"/>
+        <w:keepNext/>
+        <w:spacing w:after="80" w:before="200" w:line="288"/>
+        <w:jc w:val="both"/>
+      </w:pPr>
+      <w:r>
+        <w:rPr>
+          <w:rFonts w:ascii="Times New Roman" w:cs="Times New Roman" w:eastAsia="Times New Roman" w:hAnsi="Times New Roman"/>
+          <w:b/>
+          <w:bCs/>
+          <w:sz w:val="26"/>
+          <w:szCs w:val="26"/>
+        </w:rPr>
+        <w:t xml:space="preserve">Điều 5. Thanh toán và công nợ</w:t>
+      </w:r>
+    </w:p>
+    <w:p>
+      <w:pPr>
+        <w:spacing w:after="80" w:before="40" w:line="288"/>
+        <w:jc w:val="both"/>
+      </w:pPr>
+      <w:r>
+        <w:rPr>
+          <w:rFonts w:ascii="Times New Roman" w:cs="Times New Roman" w:eastAsia="Times New Roman" w:hAnsi="Times New Roman"/>
+          <w:sz w:val="26"/>
+          <w:szCs w:val="26"/>
+        </w:rPr>
+        <w:t xml:space="preserve">5.1. Phương thức: chuyển khoản. Thời hạn:</w:t>
+      </w:r>
+    </w:p>
+    <w:p>
+      <w:pPr>
+        <w:pBdr>
+          <w:left w:val="single" w:color="4F81BD" w:sz="18" w:space="6"/>
+        </w:pBdr>
+        <w:shd w:fill="EAF1FB" w:color="auto" w:val="clear"/>
+        <w:spacing w:after="40" w:before="20" w:line="288"/>
+        <w:ind w:left="360"/>
+        <w:jc w:val="both"/>
+      </w:pPr>
+      <w:r>
+        <w:t xml:space="preserve">{#pa_2_a}</w:t>
+      </w:r>
+    </w:p>
+    <w:p>
+      <w:pPr>
+        <w:pBdr>
+          <w:left w:val="single" w:color="4F81BD" w:sz="18" w:space="6"/>
+        </w:pBdr>
+        <w:shd w:fill="EAF1FB" w:color="auto" w:val="clear"/>
+        <w:spacing w:after="40" w:before="20" w:line="288"/>
+        <w:ind w:left="360"/>
+        <w:jc w:val="both"/>
+      </w:pPr>
+      <w:r>
+        <w:rPr>
+          <w:rFonts w:ascii="Times New Roman" w:cs="Times New Roman" w:eastAsia="Times New Roman" w:hAnsi="Times New Roman"/>
+          <w:sz w:val="26"/>
+          <w:szCs w:val="26"/>
+        </w:rPr>
+        <w:t xml:space="preserve">{pa_2_a_o} </w:t>
+      </w:r>
+      <w:r>
+        <w:rPr>
+          <w:rFonts w:ascii="Times New Roman" w:cs="Times New Roman" w:eastAsia="Times New Roman" w:hAnsi="Times New Roman"/>
+          <w:b/>
+          <w:bCs/>
+          <w:sz w:val="26"/>
+          <w:szCs w:val="26"/>
+        </w:rPr>
+        <w:t xml:space="preserve">Phương án A:</w:t>
+      </w:r>
+      <w:r>
+        <w:rPr>
+          <w:rFonts w:ascii="Times New Roman" w:cs="Times New Roman" w:eastAsia="Times New Roman" w:hAnsi="Times New Roman"/>
+          <w:sz w:val="26"/>
+          <w:szCs w:val="26"/>
+        </w:rPr>
+        <w:t xml:space="preserve"> Thanh toán trong vòng {o_16}  ngày kể từ ngày nhận hàng và hóa đơn hợp lệ.</w:t>
+      </w:r>
+    </w:p>
+    <w:p>
+      <w:pPr>
+        <w:pBdr>
+          <w:left w:val="single" w:color="4F81BD" w:sz="18" w:space="6"/>
+        </w:pBdr>
+        <w:shd w:fill="EAF1FB" w:color="auto" w:val="clear"/>
+        <w:spacing w:after="40" w:before="20" w:line="288"/>
+        <w:ind w:left="360"/>
+        <w:jc w:val="both"/>
+      </w:pPr>
+      <w:r>
+        <w:t xml:space="preserve">{/pa_2_a}</w:t>
+      </w:r>
+    </w:p>
+    <w:p>
+      <w:pPr>
+        <w:pBdr>
+          <w:left w:val="single" w:color="4F81BD" w:sz="18" w:space="6"/>
+        </w:pBdr>
+        <w:shd w:fill="EAF1FB" w:color="auto" w:val="clear"/>
+        <w:spacing w:after="40" w:before="20" w:line="288"/>
+        <w:ind w:left="360"/>
+        <w:jc w:val="both"/>
+      </w:pPr>
+      <w:r>
+        <w:t xml:space="preserve">{#pa_2_b}</w:t>
+      </w:r>
+    </w:p>
+    <w:p>
+      <w:pPr>
+        <w:pBdr>
+          <w:left w:val="single" w:color="4F81BD" w:sz="18" w:space="6"/>
+        </w:pBdr>
+        <w:shd w:fill="EAF1FB" w:color="auto" w:val="clear"/>
+        <w:spacing w:after="40" w:before="20" w:line="288"/>
+        <w:ind w:left="360"/>
+        <w:jc w:val="both"/>
+      </w:pPr>
+      <w:r>
+        <w:rPr>
+          <w:rFonts w:ascii="Times New Roman" w:cs="Times New Roman" w:eastAsia="Times New Roman" w:hAnsi="Times New Roman"/>
+          <w:sz w:val="26"/>
+          <w:szCs w:val="26"/>
+        </w:rPr>
+        <w:t xml:space="preserve">{pa_2_b_o} </w:t>
+      </w:r>
+      <w:r>
+        <w:rPr>
+          <w:rFonts w:ascii="Times New Roman" w:cs="Times New Roman" w:eastAsia="Times New Roman" w:hAnsi="Times New Roman"/>
+          <w:b/>
+          <w:bCs/>
+          <w:sz w:val="26"/>
+          <w:szCs w:val="26"/>
+        </w:rPr>
+        <w:t xml:space="preserve">Phương án B:</w:t>
+      </w:r>
+      <w:r>
+        <w:rPr>
+          <w:rFonts w:ascii="Times New Roman" w:cs="Times New Roman" w:eastAsia="Times New Roman" w:hAnsi="Times New Roman"/>
+          <w:sz w:val="26"/>
+          <w:szCs w:val="26"/>
+        </w:rPr>
+        <w:t xml:space="preserve"> Đối chiếu công nợ hằng tháng; thanh toán toàn bộ công nợ của tháng trước trước ngày {o_17} của tháng sau.</w:t>
+      </w:r>
+    </w:p>
+    <w:p>
+      <w:pPr>
+        <w:pBdr>
+          <w:left w:val="single" w:color="4F81BD" w:sz="18" w:space="6"/>
+        </w:pBdr>
+        <w:shd w:fill="EAF1FB" w:color="auto" w:val="clear"/>
+        <w:spacing w:after="40" w:before="20" w:line="288"/>
+        <w:ind w:left="360"/>
+        <w:jc w:val="both"/>
+      </w:pPr>
+      <w:r>
+        <w:t xml:space="preserve">{/pa_2_b}</w:t>
+      </w:r>
+    </w:p>
+    <w:p>
+      <w:pPr>
+        <w:spacing w:after="80" w:before="40" w:line="288"/>
+        <w:jc w:val="both"/>
+      </w:pPr>
+      <w:r>
+        <w:rPr>
+          <w:rFonts w:ascii="Times New Roman" w:cs="Times New Roman" w:eastAsia="Times New Roman" w:hAnsi="Times New Roman"/>
+          <w:sz w:val="26"/>
+          <w:szCs w:val="26"/>
+        </w:rPr>
+        <w:t xml:space="preserve">5.2. Hạn mức công nợ Bên B dành cho Bên A: {o_18} đồng.</w:t>
+      </w:r>
+    </w:p>
+    <w:p>
+      <w:pPr>
+        <w:spacing w:after="80" w:before="40" w:line="288"/>
+        <w:jc w:val="both"/>
+      </w:pPr>
+      <w:r>
+        <w:rPr>
+          <w:rFonts w:ascii="Times New Roman" w:cs="Times New Roman" w:eastAsia="Times New Roman" w:hAnsi="Times New Roman"/>
+          <w:sz w:val="26"/>
+          <w:szCs w:val="26"/>
+        </w:rPr>
+        <w:t xml:space="preserve">5.3. Trước ngày {o_19} hằng tháng, hai bên ký </w:t>
+      </w:r>
+      <w:r>
+        <w:rPr>
+          <w:rFonts w:ascii="Times New Roman" w:cs="Times New Roman" w:eastAsia="Times New Roman" w:hAnsi="Times New Roman"/>
+          <w:b/>
+          <w:bCs/>
+          <w:sz w:val="26"/>
+          <w:szCs w:val="26"/>
+        </w:rPr>
+        <w:t xml:space="preserve">biên bản đối chiếu công nợ</w:t>
+      </w:r>
+      <w:r>
+        <w:rPr>
+          <w:rFonts w:ascii="Times New Roman" w:cs="Times New Roman" w:eastAsia="Times New Roman" w:hAnsi="Times New Roman"/>
+          <w:sz w:val="26"/>
+          <w:szCs w:val="26"/>
+        </w:rPr>
+        <w:t xml:space="preserve">. Quá {o_20} ngày kể từ ngày nhận mà Bên A không có ý kiến thì số liệu do Bên B gửi được coi là đã xác nhận.</w:t>
+      </w:r>
+    </w:p>
+    <w:p>
+      <w:pPr>
+        <w:spacing w:after="80" w:before="40" w:line="288"/>
+        <w:jc w:val="both"/>
+      </w:pPr>
+      <w:r>
+        <w:rPr>
+          <w:rFonts w:ascii="Times New Roman" w:cs="Times New Roman" w:eastAsia="Times New Roman" w:hAnsi="Times New Roman"/>
+          <w:sz w:val="26"/>
+          <w:szCs w:val="26"/>
+        </w:rPr>
+        <w:t xml:space="preserve">5.4. Hóa đơn: Bên B xuất hóa đơn điện tử theo từng lần giao hàng [hoặc tổng hợp theo tháng nếu pháp luật cho phép], ghi đúng tên, mã số thuế của Bên A và tên công trình.</w:t>
+      </w:r>
+    </w:p>
+    <w:p>
+      <w:pPr>
+        <w:pStyle w:val="Heading2"/>
+        <w:keepNext/>
+        <w:spacing w:after="80" w:before="200" w:line="288"/>
+        <w:jc w:val="both"/>
+      </w:pPr>
+      <w:r>
+        <w:rPr>
+          <w:rFonts w:ascii="Times New Roman" w:cs="Times New Roman" w:eastAsia="Times New Roman" w:hAnsi="Times New Roman"/>
+          <w:b/>
+          <w:bCs/>
+          <w:sz w:val="26"/>
+          <w:szCs w:val="26"/>
+        </w:rPr>
+        <w:t xml:space="preserve">Điều 6. Phạt vi phạm và bồi thường</w:t>
+      </w:r>
+    </w:p>
+    <w:p>
+      <w:pPr>
+        <w:spacing w:after="80" w:before="40" w:line="288"/>
+        <w:jc w:val="both"/>
+      </w:pPr>
+      <w:r>
+        <w:rPr>
+          <w:rFonts w:ascii="Times New Roman" w:cs="Times New Roman" w:eastAsia="Times New Roman" w:hAnsi="Times New Roman"/>
+          <w:sz w:val="26"/>
+          <w:szCs w:val="26"/>
+        </w:rPr>
+        <w:t xml:space="preserve">6.1. Bên vi phạm nghĩa vụ chịu phạt {o_21} % giá trị phần nghĩa vụ bị vi phạm (tối đa 8% theo Luật Thương mại) và bồi thường thiệt hại thực tế phát sinh.</w:t>
+      </w:r>
+    </w:p>
+    <w:p>
+      <w:pPr>
+        <w:spacing w:after="80" w:before="40" w:line="288"/>
+        <w:jc w:val="both"/>
+      </w:pPr>
+      <w:r>
+        <w:rPr>
+          <w:rFonts w:ascii="Times New Roman" w:cs="Times New Roman" w:eastAsia="Times New Roman" w:hAnsi="Times New Roman"/>
+          <w:sz w:val="26"/>
+          <w:szCs w:val="26"/>
+        </w:rPr>
+        <w:t xml:space="preserve">6.2. Bên A chậm thanh toán chịu lãi chậm trả {o_22} %/năm trên số tiền chậm trả.</w:t>
+      </w:r>
+    </w:p>
+    <w:p>
+      <w:pPr>
+        <w:pStyle w:val="Heading2"/>
+        <w:keepNext/>
+        <w:spacing w:after="80" w:before="200" w:line="288"/>
+        <w:jc w:val="both"/>
+      </w:pPr>
+      <w:r>
+        <w:rPr>
+          <w:rFonts w:ascii="Times New Roman" w:cs="Times New Roman" w:eastAsia="Times New Roman" w:hAnsi="Times New Roman"/>
+          <w:b/>
+          <w:bCs/>
+          <w:sz w:val="26"/>
+          <w:szCs w:val="26"/>
+        </w:rPr>
+        <w:t xml:space="preserve">Điều 7. Liêm chính trong giao dịch</w:t>
+      </w:r>
+    </w:p>
+    <w:p>
+      <w:pPr>
+        <w:spacing w:after="80" w:before="40" w:line="288"/>
+        <w:jc w:val="both"/>
+      </w:pPr>
+      <w:r>
+        <w:rPr>
+          <w:rFonts w:ascii="Times New Roman" w:cs="Times New Roman" w:eastAsia="Times New Roman" w:hAnsi="Times New Roman"/>
+          <w:sz w:val="26"/>
+          <w:szCs w:val="26"/>
+        </w:rPr>
+        <w:t xml:space="preserve">7.1. Bên B không đưa, hứa đưa tiền, quà tặng, hoa hồng hoặc lợi ích khác cho nhân viên của Bên A (mua hàng, thủ kho, chỉ huy công trường {o_23}) nhằm được chọn mua hàng, nhận hàng không đạt hoặc ký xác nhận sai số lượng.</w:t>
+      </w:r>
+    </w:p>
+    <w:p>
+      <w:pPr>
+        <w:spacing w:after="80" w:before="40" w:line="288"/>
+        <w:jc w:val="both"/>
+      </w:pPr>
+      <w:r>
+        <w:rPr>
+          <w:rFonts w:ascii="Times New Roman" w:cs="Times New Roman" w:eastAsia="Times New Roman" w:hAnsi="Times New Roman"/>
+          <w:sz w:val="26"/>
+          <w:szCs w:val="26"/>
+        </w:rPr>
+        <w:t xml:space="preserve">7.2. Vi phạm Điều này, Bên A có quyền chấm dứt Hợp đồng ngay mà không phải bồi thường, đồng thời yêu cầu Bên B bồi thường thiệt hại. Bên B báo cáo hành vi gợi ý, đòi hỏi lợi ích của nhân viên Bên A tới đường dây: {o_24}</w:t>
+      </w:r>
+    </w:p>
+    <w:p>
+      <w:pPr>
+        <w:pStyle w:val="Heading2"/>
+        <w:keepNext/>
+        <w:spacing w:after="80" w:before="200" w:line="288"/>
+        <w:jc w:val="both"/>
+      </w:pPr>
+      <w:r>
+        <w:rPr>
+          <w:rFonts w:ascii="Times New Roman" w:cs="Times New Roman" w:eastAsia="Times New Roman" w:hAnsi="Times New Roman"/>
+          <w:b/>
+          <w:bCs/>
+          <w:sz w:val="26"/>
+          <w:szCs w:val="26"/>
+        </w:rPr>
+        <w:t xml:space="preserve">Điều 8. Thời hạn và chấm dứt</w:t>
+      </w:r>
+    </w:p>
+    <w:p>
+      <w:pPr>
+        <w:spacing w:after="80" w:before="40" w:line="288"/>
+        <w:jc w:val="both"/>
+      </w:pPr>
+      <w:r>
+        <w:rPr>
+          <w:rFonts w:ascii="Times New Roman" w:cs="Times New Roman" w:eastAsia="Times New Roman" w:hAnsi="Times New Roman"/>
+          <w:sz w:val="26"/>
+          <w:szCs w:val="26"/>
+        </w:rPr>
+        <w:t xml:space="preserve">8.1. Hợp đồng có thời hạn 12 tháng kể từ ngày ký; tự động gia hạn thêm từng 12 tháng nếu không bên nào thông báo chấm dứt trước {o_25} ngày.</w:t>
+      </w:r>
+    </w:p>
+    <w:p>
+      <w:pPr>
+        <w:spacing w:after="80" w:before="40" w:line="288"/>
+        <w:jc w:val="both"/>
+      </w:pPr>
+      <w:r>
+        <w:rPr>
+          <w:rFonts w:ascii="Times New Roman" w:cs="Times New Roman" w:eastAsia="Times New Roman" w:hAnsi="Times New Roman"/>
+          <w:sz w:val="26"/>
+          <w:szCs w:val="26"/>
+        </w:rPr>
+        <w:t xml:space="preserve">8.2. Mỗi bên có quyền chấm dứt Hợp đồng bằng thông báo trước {o_26} ngày; các Đơn đặt hàng đã xác nhận vẫn phải thực hiện xong.</w:t>
+      </w:r>
+    </w:p>
+    <w:p>
+      <w:pPr>
+        <w:pStyle w:val="Heading2"/>
+        <w:keepNext/>
+        <w:spacing w:after="80" w:before="200" w:line="288"/>
+        <w:jc w:val="both"/>
+      </w:pPr>
+      <w:r>
+        <w:rPr>
+          <w:rFonts w:ascii="Times New Roman" w:cs="Times New Roman" w:eastAsia="Times New Roman" w:hAnsi="Times New Roman"/>
+          <w:b/>
+          <w:bCs/>
+          <w:sz w:val="26"/>
+          <w:szCs w:val="26"/>
+        </w:rPr>
+        <w:t xml:space="preserve">Điều 9. Sự kiện bất khả kháng và hoàn cảnh thay đổi cơ bản</w:t>
+      </w:r>
+    </w:p>
+    <w:p>
+      <w:pPr>
+        <w:spacing w:after="80" w:before="40" w:line="288"/>
+        <w:jc w:val="both"/>
+      </w:pPr>
+      <w:r>
+        <w:rPr>
+          <w:rFonts w:ascii="Times New Roman" w:cs="Times New Roman" w:eastAsia="Times New Roman" w:hAnsi="Times New Roman"/>
+          <w:sz w:val="26"/>
+          <w:szCs w:val="26"/>
+        </w:rPr>
+        <w:t xml:space="preserve">9.1. Sự kiện bất khả kháng là sự kiện xảy ra khách quan, không thể lường trước và không thể khắc phục được mặc dù đã áp dụng mọi biện pháp cần thiết trong khả năng cho phép, gồm: thiên tai, hỏa hoạn không do lỗi của các bên, dịch bệnh được cơ quan có thẩm quyền công bố, chiến tranh, bạo loạn, quyết định của cơ quan nhà nước có thẩm quyền làm ngưng trệ việc thực hiện hợp đồng và các trường hợp khác theo quy định của pháp luật.</w:t>
+      </w:r>
+    </w:p>
+    <w:p>
+      <w:pPr>
+        <w:spacing w:after="80" w:before="40" w:line="288"/>
+        <w:jc w:val="both"/>
+      </w:pPr>
+      <w:r>
+        <w:rPr>
+          <w:rFonts w:ascii="Times New Roman" w:cs="Times New Roman" w:eastAsia="Times New Roman" w:hAnsi="Times New Roman"/>
+          <w:sz w:val="26"/>
+          <w:szCs w:val="26"/>
+        </w:rPr>
+        <w:t xml:space="preserve">9.2. Bên gặp sự kiện bất khả kháng phải thông báo bằng văn bản cho bên kia trong vòng 03 (ba) ngày làm việc kể từ khi sự kiện xảy ra, kèm bằng chứng hợp lý, và áp dụng mọi biện pháp để hạn chế thiệt hại.</w:t>
+      </w:r>
+    </w:p>
+    <w:p>
+      <w:pPr>
+        <w:spacing w:after="80" w:before="40" w:line="288"/>
+        <w:jc w:val="both"/>
+      </w:pPr>
+      <w:r>
+        <w:rPr>
+          <w:rFonts w:ascii="Times New Roman" w:cs="Times New Roman" w:eastAsia="Times New Roman" w:hAnsi="Times New Roman"/>
+          <w:sz w:val="26"/>
+          <w:szCs w:val="26"/>
+        </w:rPr>
+        <w:t xml:space="preserve">9.3. Thời gian bị ảnh hưởng bởi sự kiện bất khả kháng không tính vào thời hạn thực hiện hợp đồng. Không bên nào bị phạt hoặc phải bồi thường do không thực hiện nghĩa vụ vì sự kiện bất khả kháng.</w:t>
+      </w:r>
+    </w:p>
+    <w:p>
+      <w:pPr>
+        <w:spacing w:after="80" w:before="40" w:line="288"/>
+        <w:jc w:val="both"/>
+      </w:pPr>
+      <w:r>
+        <w:rPr>
+          <w:rFonts w:ascii="Times New Roman" w:cs="Times New Roman" w:eastAsia="Times New Roman" w:hAnsi="Times New Roman"/>
+          <w:sz w:val="26"/>
+          <w:szCs w:val="26"/>
+        </w:rPr>
+        <w:t xml:space="preserve">9.4. Nếu sự kiện bất khả kháng kéo dài quá {o_27}  ngày liên tục, mỗi bên có quyền chấm dứt hợp đồng bằng văn bản; các bên thanh toán cho nhau phần công việc, hàng hóa đã thực hiện và được nghiệm thu đến thời điểm chấm dứt.</w:t>
+      </w:r>
+    </w:p>
+    <w:p>
+      <w:pPr>
+        <w:spacing w:after="80" w:before="40" w:line="288"/>
+        <w:jc w:val="both"/>
+      </w:pPr>
+      <w:r>
+        <w:rPr>
+          <w:rFonts w:ascii="Times New Roman" w:cs="Times New Roman" w:eastAsia="Times New Roman" w:hAnsi="Times New Roman"/>
+          <w:sz w:val="26"/>
+          <w:szCs w:val="26"/>
+        </w:rPr>
+        <w:t xml:space="preserve">9.5. Khi hoàn cảnh thay đổi cơ bản theo Điều 420 Bộ luật Dân sự (ví dụ: giá vật liệu chính biến động bất thường vượt quá {o_28} % so với thời điểm ký), bên bị ảnh hưởng có quyền đề nghị đàm phán lại phần giá và tiến độ liên quan trong thời hạn hợp lý.</w:t>
+      </w:r>
+    </w:p>
+    <w:p>
+      <w:pPr>
+        <w:pStyle w:val="Heading2"/>
+        <w:keepNext/>
+        <w:spacing w:after="80" w:before="200" w:line="288"/>
+        <w:jc w:val="both"/>
+      </w:pPr>
+      <w:r>
+        <w:rPr>
+          <w:rFonts w:ascii="Times New Roman" w:cs="Times New Roman" w:eastAsia="Times New Roman" w:hAnsi="Times New Roman"/>
+          <w:b/>
+          <w:bCs/>
+          <w:sz w:val="26"/>
+          <w:szCs w:val="26"/>
+        </w:rPr>
+        <w:t xml:space="preserve">Điều 10. Giải quyết tranh chấp</w:t>
+      </w:r>
+    </w:p>
+    <w:p>
+      <w:pPr>
+        <w:spacing w:after="80" w:before="40" w:line="288"/>
+        <w:jc w:val="both"/>
+      </w:pPr>
+      <w:r>
+        <w:rPr>
+          <w:rFonts w:ascii="Times New Roman" w:cs="Times New Roman" w:eastAsia="Times New Roman" w:hAnsi="Times New Roman"/>
+          <w:sz w:val="26"/>
+          <w:szCs w:val="26"/>
+        </w:rPr>
+        <w:t xml:space="preserve">10.1. Khi phát sinh tranh chấp, các bên ưu tiên thương lượng, hòa giải trên tinh thần thiện chí. Bên nhận được yêu cầu giải quyết phải trả lời bằng văn bản trong vòng 07 (bảy) ngày làm việc.</w:t>
+      </w:r>
+    </w:p>
+    <w:p>
+      <w:pPr>
+        <w:spacing w:after="80" w:before="40" w:line="288"/>
+        <w:jc w:val="both"/>
+      </w:pPr>
+      <w:r>
+        <w:rPr>
+          <w:rFonts w:ascii="Times New Roman" w:cs="Times New Roman" w:eastAsia="Times New Roman" w:hAnsi="Times New Roman"/>
+          <w:sz w:val="26"/>
+          <w:szCs w:val="26"/>
+        </w:rPr>
+        <w:t xml:space="preserve">10.2. Trường hợp thương lượng không thành trong vòng 30 (ba mươi) ngày kể từ ngày một bên gửi yêu cầu, tranh chấp được giải quyết theo phương án sau:</w:t>
+      </w:r>
+    </w:p>
+    <w:p>
+      <w:pPr>
+        <w:pBdr>
+          <w:left w:val="single" w:color="4F81BD" w:sz="18" w:space="6"/>
+        </w:pBdr>
+        <w:shd w:fill="EAF1FB" w:color="auto" w:val="clear"/>
+        <w:spacing w:after="40" w:before="20" w:line="288"/>
+        <w:ind w:left="360"/>
+        <w:jc w:val="both"/>
+      </w:pPr>
+      <w:r>
+        <w:t xml:space="preserve">{#pa_3_a}</w:t>
+      </w:r>
+    </w:p>
+    <w:p>
+      <w:pPr>
+        <w:pBdr>
+          <w:left w:val="single" w:color="4F81BD" w:sz="18" w:space="6"/>
+        </w:pBdr>
+        <w:shd w:fill="EAF1FB" w:color="auto" w:val="clear"/>
+        <w:spacing w:after="40" w:before="20" w:line="288"/>
+        <w:ind w:left="360"/>
+        <w:jc w:val="both"/>
+      </w:pPr>
+      <w:r>
+        <w:rPr>
+          <w:rFonts w:ascii="Times New Roman" w:cs="Times New Roman" w:eastAsia="Times New Roman" w:hAnsi="Times New Roman"/>
+          <w:sz w:val="26"/>
+          <w:szCs w:val="26"/>
+        </w:rPr>
+        <w:t xml:space="preserve">{pa_3_a_o} </w:t>
+      </w:r>
+      <w:r>
+        <w:rPr>
+          <w:rFonts w:ascii="Times New Roman" w:cs="Times New Roman" w:eastAsia="Times New Roman" w:hAnsi="Times New Roman"/>
+          <w:b/>
+          <w:bCs/>
+          <w:sz w:val="26"/>
+          <w:szCs w:val="26"/>
+        </w:rPr>
+        <w:t xml:space="preserve">Phương án A:</w:t>
+      </w:r>
+      <w:r>
+        <w:rPr>
+          <w:rFonts w:ascii="Times New Roman" w:cs="Times New Roman" w:eastAsia="Times New Roman" w:hAnsi="Times New Roman"/>
+          <w:sz w:val="26"/>
+          <w:szCs w:val="26"/>
+        </w:rPr>
+        <w:t xml:space="preserve"> Tòa án nhân dân có thẩm quyền theo quy định của pháp luật tố tụng dân sự giải quyết theo quy định của pháp luật Việt Nam.</w:t>
+      </w:r>
+    </w:p>
+    <w:p>
+      <w:pPr>
+        <w:pBdr>
+          <w:left w:val="single" w:color="4F81BD" w:sz="18" w:space="6"/>
+        </w:pBdr>
+        <w:shd w:fill="EAF1FB" w:color="auto" w:val="clear"/>
+        <w:spacing w:after="40" w:before="20" w:line="288"/>
+        <w:ind w:left="360"/>
+        <w:jc w:val="both"/>
+      </w:pPr>
+      <w:r>
+        <w:t xml:space="preserve">{/pa_3_a}</w:t>
+      </w:r>
+    </w:p>
+    <w:p>
+      <w:pPr>
+        <w:pBdr>
+          <w:left w:val="single" w:color="4F81BD" w:sz="18" w:space="6"/>
+        </w:pBdr>
+        <w:shd w:fill="EAF1FB" w:color="auto" w:val="clear"/>
+        <w:spacing w:after="40" w:before="20" w:line="288"/>
+        <w:ind w:left="360"/>
+        <w:jc w:val="both"/>
+      </w:pPr>
+      <w:r>
+        <w:t xml:space="preserve">{#pa_3_b}</w:t>
+      </w:r>
+    </w:p>
+    <w:p>
+      <w:pPr>
+        <w:pBdr>
+          <w:left w:val="single" w:color="4F81BD" w:sz="18" w:space="6"/>
+        </w:pBdr>
+        <w:shd w:fill="EAF1FB" w:color="auto" w:val="clear"/>
+        <w:spacing w:after="40" w:before="20" w:line="288"/>
+        <w:ind w:left="360"/>
+        <w:jc w:val="both"/>
+      </w:pPr>
+      <w:r>
+        <w:rPr>
+          <w:rFonts w:ascii="Times New Roman" w:cs="Times New Roman" w:eastAsia="Times New Roman" w:hAnsi="Times New Roman"/>
+          <w:sz w:val="26"/>
+          <w:szCs w:val="26"/>
+        </w:rPr>
+        <w:t xml:space="preserve">{pa_3_b_o} </w:t>
+      </w:r>
+      <w:r>
+        <w:rPr>
+          <w:rFonts w:ascii="Times New Roman" w:cs="Times New Roman" w:eastAsia="Times New Roman" w:hAnsi="Times New Roman"/>
+          <w:b/>
+          <w:bCs/>
+          <w:sz w:val="26"/>
+          <w:szCs w:val="26"/>
+        </w:rPr>
+        <w:t xml:space="preserve">Phương án B:</w:t>
+      </w:r>
+      <w:r>
+        <w:rPr>
+          <w:rFonts w:ascii="Times New Roman" w:cs="Times New Roman" w:eastAsia="Times New Roman" w:hAnsi="Times New Roman"/>
+          <w:sz w:val="26"/>
+          <w:szCs w:val="26"/>
+        </w:rPr>
+        <w:t xml:space="preserve"> Trung tâm Trọng tài Quốc tế Việt Nam (VIAC) giải quyết theo Quy tắc tố tụng trọng tài của Trung tâm này; phán quyết trọng tài là chung thẩm. Số trọng tài viên: 01; địa điểm: Hà Nội; ngôn ngữ: tiếng Việt.</w:t>
+      </w:r>
+    </w:p>
+    <w:p>
+      <w:pPr>
+        <w:pBdr>
+          <w:left w:val="single" w:color="4F81BD" w:sz="18" w:space="6"/>
+        </w:pBdr>
+        <w:shd w:fill="EAF1FB" w:color="auto" w:val="clear"/>
+        <w:spacing w:after="40" w:before="20" w:line="288"/>
+        <w:ind w:left="360"/>
+        <w:jc w:val="both"/>
+      </w:pPr>
+      <w:r>
+        <w:t xml:space="preserve">{/pa_3_b}</w:t>
+      </w:r>
+    </w:p>
+    <w:p>
+      <w:pPr>
+        <w:spacing w:after="80" w:before="40" w:line="288"/>
+        <w:jc w:val="both"/>
+      </w:pPr>
+      <w:r>
+        <w:rPr>
+          <w:rFonts w:ascii="Times New Roman" w:cs="Times New Roman" w:eastAsia="Times New Roman" w:hAnsi="Times New Roman"/>
+          <w:sz w:val="26"/>
+          <w:szCs w:val="26"/>
+        </w:rPr>
+        <w:t xml:space="preserve">10.3. Trong thời gian giải quyết tranh chấp, các bên tiếp tục thực hiện các nghĩa vụ không bị tranh chấp, trừ khi hợp đồng đã chấm dứt.</w:t>
+      </w:r>
+    </w:p>
+    <w:p>
+      <w:pPr>
+        <w:pStyle w:val="Heading2"/>
+        <w:keepNext/>
+        <w:spacing w:after="80" w:before="200" w:line="288"/>
+        <w:jc w:val="both"/>
+      </w:pPr>
+      <w:r>
+        <w:rPr>
+          <w:rFonts w:ascii="Times New Roman" w:cs="Times New Roman" w:eastAsia="Times New Roman" w:hAnsi="Times New Roman"/>
+          <w:b/>
+          <w:bCs/>
+          <w:sz w:val="26"/>
+          <w:szCs w:val="26"/>
+        </w:rPr>
         <w:t xml:space="preserve">Điều 11. Hiệu lực và điều khoản thi hành</w:t>
       </w:r>
     </w:p>
@@ -1491,7 +1687,7 @@
           <w:sz w:val="26"/>
           <w:szCs w:val="26"/>
         </w:rPr>
-        <w:t xml:space="preserve">11.1. Hợp đồng có hiệu lực kể từ [ngày ký / ngày bên có quyền nhận được bảo đảm thực hiện hợp đồng/tiền tạm ứng – chọn một].</w:t>
+        <w:t xml:space="preserve">11.1. Hợp đồng có hiệu lực kể từ {c_2}.</w:t>
       </w:r>
     </w:p>
     <w:p>
@@ -1703,7 +1899,7 @@
           <w:sz w:val="26"/>
           <w:szCs w:val="26"/>
         </w:rPr>
-        <w:t xml:space="preserve">Hiệu lực từ ngày ……/……/20……</w:t>
+        <w:t xml:space="preserve">Hiệu lực từ ngày {o_29}/20{o_30}</w:t>
       </w:r>
     </w:p>
     <w:tbl>
@@ -2399,7 +2595,7 @@
                 <w:sz w:val="24"/>
                 <w:szCs w:val="24"/>
               </w:rPr>
-              <w:t xml:space="preserve">Bê tông thương phẩm M……, độ sụt ……</w:t>
+              <w:t xml:space="preserve">Bê tông thương phẩm M{o_31}, độ sụt {o_32}</w:t>
             </w:r>
           </w:p>
         </w:tc>
@@ -2596,7 +2792,7 @@
                 <w:sz w:val="24"/>
                 <w:szCs w:val="24"/>
               </w:rPr>
-              <w:t xml:space="preserve">Gạch ……</w:t>
+              <w:t xml:space="preserve">Gạch {o_33}</w:t>
             </w:r>
           </w:p>
         </w:tc>
@@ -3172,7 +3368,7 @@
           <w:sz w:val="26"/>
           <w:szCs w:val="26"/>
         </w:rPr>
-        <w:t xml:space="preserve">Số: ………/ĐĐH-NVC – Ngày ……/……/20…… – Theo Hợp đồng nguyên tắc số ……………</w:t>
+        <w:t xml:space="preserve">Số: {o_34}/ĐĐH-NVC – Ngày {o_35}/20{o_36} – Theo Hợp đồng nguyên tắc số {o_37}</w:t>
       </w:r>
     </w:p>
     <w:p>
@@ -3186,7 +3382,7 @@
           <w:sz w:val="26"/>
           <w:szCs w:val="26"/>
         </w:rPr>
-        <w:t xml:space="preserve">Bên mua: CÔNG TY TNHH TƯ VẤN XÂY DỰNG VÀ PHÁT TRIỂN NHÀ VIỆT. Người đặt hàng: ……………………… – ĐT: ………………</w:t>
+        <w:t xml:space="preserve">Bên mua: CÔNG TY TNHH TƯ VẤN XÂY DỰNG VÀ PHÁT TRIỂN NHÀ VIỆT. Người đặt hàng: {o_38} – ĐT: {o_39}</w:t>
       </w:r>
     </w:p>
     <w:p>
@@ -3200,7 +3396,7 @@
           <w:sz w:val="26"/>
           <w:szCs w:val="26"/>
         </w:rPr>
-        <w:t xml:space="preserve">Bên bán: ………………………………………</w:t>
+        <w:t xml:space="preserve">Bên bán: {o_40}</w:t>
       </w:r>
     </w:p>
     <w:p>
@@ -3214,7 +3410,7 @@
           <w:sz w:val="26"/>
           <w:szCs w:val="26"/>
         </w:rPr>
-        <w:t xml:space="preserve">Công trình/mã dự án: …………………… – Địa chỉ giao hàng: ……………………………</w:t>
+        <w:t xml:space="preserve">Công trình/mã dự án: {o_41} – Địa chỉ giao hàng: {o_42}</w:t>
       </w:r>
     </w:p>
     <w:tbl>
@@ -4203,7 +4399,7 @@
           <w:sz w:val="26"/>
           <w:szCs w:val="26"/>
         </w:rPr>
-        <w:t xml:space="preserve">Yêu cầu kèm theo: CO/CQ; phiếu cân; phiếu giao bê tông; …………………</w:t>
+        <w:t xml:space="preserve">Yêu cầu kèm theo: CO/CQ; phiếu cân; phiếu giao bê tông; {o_43}</w:t>
       </w:r>
     </w:p>
     <w:p>

</xml_diff>

<commit_message>
Soạn hợp đồng: bấm chỗ vàng tới ô điền; danh sách Điều còn thiếu; gộp nơi ký; nhãn bên / ô bảng
- Bản xem trước gắn khoá vào chỗ trống chưa điền — bấm là mở đúng Điều, đặt con trỏ vào ô.
- Khung ô thiếu luôn mở khi còn thiếu, liệt kê «Điều 7 · 5» bấm tới chỗ trống đầu tiên.
- convert.py: nơi ký ở đầu văn bản và «Hôm nay … tại …» thành một chỗ trống chuẩn {noi_ky};
  chỗ trống ở phần hai bên ghi «Bên A / Bên B»; ô bảng ghi «<hàng> — <cột>» (trước chỉ «___»,
  trông như lặp lại).

Co-Authored-By: Claude Opus 5.5 <noreply@anthropic.com>
</commit_message>
<xml_diff>
--- a/db/seed-assets/contract-templates/NVC/NVC-DC-04_Hop_dong_nguyen_tac_nha_cung_cap.docx
+++ b/db/seed-assets/contract-templates/NVC/NVC-DC-04_Hop_dong_nguyen_tac_nha_cung_cap.docx
@@ -143,7 +143,7 @@
                 <w:sz w:val="24"/>
                 <w:szCs w:val="24"/>
               </w:rPr>
-              <w:t xml:space="preserve">{o_1}, ngày {ngay_ky_ngay} tháng {ngay_ky_thang} năm {ngay_ky_nam}</w:t>
+              <w:t xml:space="preserve">{noi_ky}, ngày {ngay_ky_ngay} tháng {ngay_ky_thang} năm {ngay_ky_nam}</w:t>
             </w:r>
           </w:p>
         </w:tc>
@@ -299,7 +299,7 @@
           <w:sz w:val="26"/>
           <w:szCs w:val="26"/>
         </w:rPr>
-        <w:t xml:space="preserve">Hôm nay, ngày {ngay_ky_ngay} tháng {ngay_ky_thang} năm {ngay_ky_nam}, tại {o_2}, chúng tôi gồm:</w:t>
+        <w:t xml:space="preserve">Hôm nay, ngày {ngay_ky_ngay} tháng {ngay_ky_thang} năm {ngay_ky_nam}, tại {noi_ky}, chúng tôi gồm:</w:t>
       </w:r>
     </w:p>
     <w:p>
@@ -408,7 +408,7 @@
           <w:sz w:val="26"/>
           <w:szCs w:val="26"/>
         </w:rPr>
-        <w:t xml:space="preserve">(Hoặc người được ủy quyền: {o_3} – Chức vụ: {o_4} – theo Giấy ủy quyền số {o_5} ngày {o_6})</w:t>
+        <w:t xml:space="preserve">(Hoặc người được ủy quyền: {o_1} – Chức vụ: {o_2} – theo Giấy ủy quyền số {o_3} ngày {o_4})</w:t>
       </w:r>
     </w:p>
     <w:p>
@@ -517,7 +517,7 @@
           <w:sz w:val="26"/>
           <w:szCs w:val="26"/>
         </w:rPr>
-        <w:t xml:space="preserve">(Theo Giấy ủy quyền số {o_7} ngày {o_8} – nếu người ký không phải đại diện theo pháp luật)</w:t>
+        <w:t xml:space="preserve">(Theo Giấy ủy quyền số {o_5} ngày {o_6} – nếu người ký không phải đại diện theo pháp luật)</w:t>
       </w:r>
     </w:p>
     <w:p>
@@ -628,7 +628,7 @@
           <w:sz w:val="26"/>
           <w:szCs w:val="26"/>
         </w:rPr>
-        <w:t xml:space="preserve"> (mẫu tại Phụ lục 02) do người có thẩm quyền của Bên A ký và gửi qua email/văn bản; Bên B xác nhận trong vòng {o_9}  giờ làm việc. Đơn đặt hàng đã xác nhận là bộ phận không tách rời của Hợp đồng.</w:t>
+        <w:t xml:space="preserve"> (mẫu tại Phụ lục 02) do người có thẩm quyền của Bên A ký và gửi qua email/văn bản; Bên B xác nhận trong vòng {o_7}  giờ làm việc. Đơn đặt hàng đã xác nhận là bộ phận không tách rời của Hợp đồng.</w:t>
       </w:r>
     </w:p>
     <w:p>
@@ -804,7 +804,7 @@
           <w:sz w:val="26"/>
           <w:szCs w:val="26"/>
         </w:rPr>
-        <w:t xml:space="preserve"> Giá cố định cho từng Đơn đặt hàng đã xác nhận. Khi giá thị trường biến động, Bên B gửi thông báo giá mới trước ít nhất {o_10}  ngày; giá mới chỉ áp dụng cho Đơn đặt hàng gửi sau ngày hiệu lực của thông báo và khi Bên A chấp thuận bằng văn bản.</w:t>
+        <w:t xml:space="preserve"> Giá cố định cho từng Đơn đặt hàng đã xác nhận. Khi giá thị trường biến động, Bên B gửi thông báo giá mới trước ít nhất {o_8}  ngày; giá mới chỉ áp dụng cho Đơn đặt hàng gửi sau ngày hiệu lực của thông báo và khi Bên A chấp thuận bằng văn bản.</w:t>
       </w:r>
     </w:p>
     <w:p>
@@ -869,7 +869,7 @@
           <w:sz w:val="26"/>
           <w:szCs w:val="26"/>
         </w:rPr>
-        <w:t xml:space="preserve"> Giá điều chỉnh theo giá niêm yết của nhà sản xuất {o_11} tại ngày giao hàng, chiết khấu {o_12} %.</w:t>
+        <w:t xml:space="preserve"> Giá điều chỉnh theo giá niêm yết của nhà sản xuất {o_9} tại ngày giao hàng, chiết khấu {o_10} %.</w:t>
       </w:r>
     </w:p>
     <w:p>
@@ -957,7 +957,7 @@
           <w:sz w:val="26"/>
           <w:szCs w:val="26"/>
         </w:rPr>
-        <w:t xml:space="preserve">3.3. Giao chậm quá {o_13} giờ/ngày so với Đơn đặt hàng mà không được Bên A chấp thuận, Bên A có quyền từ chối nhận hàng và mua của nhà cung cấp khác; Bên B chịu phần chênh lệch giá (nếu có).</w:t>
+        <w:t xml:space="preserve">3.3. Giao chậm quá {o_11} giờ/ngày so với Đơn đặt hàng mà không được Bên A chấp thuận, Bên A có quyền từ chối nhận hàng và mua của nhà cung cấp khác; Bên B chịu phần chênh lệch giá (nếu có).</w:t>
       </w:r>
     </w:p>
     <w:p>
@@ -1017,7 +1017,7 @@
           <w:sz w:val="26"/>
           <w:szCs w:val="26"/>
         </w:rPr>
-        <w:t xml:space="preserve">4.3. Hàng không đạt chất lượng, sai quy cách: Bên A có quyền trả lại; Bên B đổi hàng trong vòng {o_14} ngày và chịu chi phí vận chuyển. Khuyết tật ẩn phát hiện trong vòng {o_15} tháng kể từ ngày giao vẫn thuộc trách nhiệm của Bên B.</w:t>
+        <w:t xml:space="preserve">4.3. Hàng không đạt chất lượng, sai quy cách: Bên A có quyền trả lại; Bên B đổi hàng trong vòng {o_12} ngày và chịu chi phí vận chuyển. Khuyết tật ẩn phát hiện trong vòng {o_13} tháng kể từ ngày giao vẫn thuộc trách nhiệm của Bên B.</w:t>
       </w:r>
     </w:p>
     <w:p>
@@ -1100,7 +1100,7 @@
           <w:sz w:val="26"/>
           <w:szCs w:val="26"/>
         </w:rPr>
-        <w:t xml:space="preserve"> Thanh toán trong vòng {o_16}  ngày kể từ ngày nhận hàng và hóa đơn hợp lệ.</w:t>
+        <w:t xml:space="preserve"> Thanh toán trong vòng {o_14}  ngày kể từ ngày nhận hàng và hóa đơn hợp lệ.</w:t>
       </w:r>
     </w:p>
     <w:p>
@@ -1165,7 +1165,7 @@
           <w:sz w:val="26"/>
           <w:szCs w:val="26"/>
         </w:rPr>
-        <w:t xml:space="preserve"> Đối chiếu công nợ hằng tháng; thanh toán toàn bộ công nợ của tháng trước trước ngày {o_17} của tháng sau.</w:t>
+        <w:t xml:space="preserve"> Đối chiếu công nợ hằng tháng; thanh toán toàn bộ công nợ của tháng trước trước ngày {o_15} của tháng sau.</w:t>
       </w:r>
     </w:p>
     <w:p>
@@ -1193,7 +1193,7 @@
           <w:sz w:val="26"/>
           <w:szCs w:val="26"/>
         </w:rPr>
-        <w:t xml:space="preserve">5.2. Hạn mức công nợ Bên B dành cho Bên A: {o_18} đồng.</w:t>
+        <w:t xml:space="preserve">5.2. Hạn mức công nợ Bên B dành cho Bên A: {o_16} đồng.</w:t>
       </w:r>
     </w:p>
     <w:p>
@@ -1207,7 +1207,7 @@
           <w:sz w:val="26"/>
           <w:szCs w:val="26"/>
         </w:rPr>
-        <w:t xml:space="preserve">5.3. Trước ngày {o_19} hằng tháng, hai bên ký </w:t>
+        <w:t xml:space="preserve">5.3. Trước ngày {o_17} hằng tháng, hai bên ký </w:t>
       </w:r>
       <w:r>
         <w:rPr>
@@ -1225,7 +1225,7 @@
           <w:sz w:val="26"/>
           <w:szCs w:val="26"/>
         </w:rPr>
-        <w:t xml:space="preserve">. Quá {o_20} ngày kể từ ngày nhận mà Bên A không có ý kiến thì số liệu do Bên B gửi được coi là đã xác nhận.</w:t>
+        <w:t xml:space="preserve">. Quá {o_18} ngày kể từ ngày nhận mà Bên A không có ý kiến thì số liệu do Bên B gửi được coi là đã xác nhận.</w:t>
       </w:r>
     </w:p>
     <w:p>
@@ -1271,7 +1271,7 @@
           <w:sz w:val="26"/>
           <w:szCs w:val="26"/>
         </w:rPr>
-        <w:t xml:space="preserve">6.1. Bên vi phạm nghĩa vụ chịu phạt {o_21} % giá trị phần nghĩa vụ bị vi phạm (tối đa 8% theo Luật Thương mại) và bồi thường thiệt hại thực tế phát sinh.</w:t>
+        <w:t xml:space="preserve">6.1. Bên vi phạm nghĩa vụ chịu phạt {o_19} % giá trị phần nghĩa vụ bị vi phạm (tối đa 8% theo Luật Thương mại) và bồi thường thiệt hại thực tế phát sinh.</w:t>
       </w:r>
     </w:p>
     <w:p>
@@ -1285,7 +1285,7 @@
           <w:sz w:val="26"/>
           <w:szCs w:val="26"/>
         </w:rPr>
-        <w:t xml:space="preserve">6.2. Bên A chậm thanh toán chịu lãi chậm trả {o_22} %/năm trên số tiền chậm trả.</w:t>
+        <w:t xml:space="preserve">6.2. Bên A chậm thanh toán chịu lãi chậm trả {o_20} %/năm trên số tiền chậm trả.</w:t>
       </w:r>
     </w:p>
     <w:p>
@@ -1317,7 +1317,7 @@
           <w:sz w:val="26"/>
           <w:szCs w:val="26"/>
         </w:rPr>
-        <w:t xml:space="preserve">7.1. Bên B không đưa, hứa đưa tiền, quà tặng, hoa hồng hoặc lợi ích khác cho nhân viên của Bên A (mua hàng, thủ kho, chỉ huy công trường {o_23}) nhằm được chọn mua hàng, nhận hàng không đạt hoặc ký xác nhận sai số lượng.</w:t>
+        <w:t xml:space="preserve">7.1. Bên B không đưa, hứa đưa tiền, quà tặng, hoa hồng hoặc lợi ích khác cho nhân viên của Bên A (mua hàng, thủ kho, chỉ huy công trường {o_21}) nhằm được chọn mua hàng, nhận hàng không đạt hoặc ký xác nhận sai số lượng.</w:t>
       </w:r>
     </w:p>
     <w:p>
@@ -1331,7 +1331,7 @@
           <w:sz w:val="26"/>
           <w:szCs w:val="26"/>
         </w:rPr>
-        <w:t xml:space="preserve">7.2. Vi phạm Điều này, Bên A có quyền chấm dứt Hợp đồng ngay mà không phải bồi thường, đồng thời yêu cầu Bên B bồi thường thiệt hại. Bên B báo cáo hành vi gợi ý, đòi hỏi lợi ích của nhân viên Bên A tới đường dây: {o_24}</w:t>
+        <w:t xml:space="preserve">7.2. Vi phạm Điều này, Bên A có quyền chấm dứt Hợp đồng ngay mà không phải bồi thường, đồng thời yêu cầu Bên B bồi thường thiệt hại. Bên B báo cáo hành vi gợi ý, đòi hỏi lợi ích của nhân viên Bên A tới đường dây: {o_22}</w:t>
       </w:r>
     </w:p>
     <w:p>
@@ -1363,7 +1363,7 @@
           <w:sz w:val="26"/>
           <w:szCs w:val="26"/>
         </w:rPr>
-        <w:t xml:space="preserve">8.1. Hợp đồng có thời hạn 12 tháng kể từ ngày ký; tự động gia hạn thêm từng 12 tháng nếu không bên nào thông báo chấm dứt trước {o_25} ngày.</w:t>
+        <w:t xml:space="preserve">8.1. Hợp đồng có thời hạn 12 tháng kể từ ngày ký; tự động gia hạn thêm từng 12 tháng nếu không bên nào thông báo chấm dứt trước {o_23} ngày.</w:t>
       </w:r>
     </w:p>
     <w:p>
@@ -1377,7 +1377,7 @@
           <w:sz w:val="26"/>
           <w:szCs w:val="26"/>
         </w:rPr>
-        <w:t xml:space="preserve">8.2. Mỗi bên có quyền chấm dứt Hợp đồng bằng thông báo trước {o_26} ngày; các Đơn đặt hàng đã xác nhận vẫn phải thực hiện xong.</w:t>
+        <w:t xml:space="preserve">8.2. Mỗi bên có quyền chấm dứt Hợp đồng bằng thông báo trước {o_24} ngày; các Đơn đặt hàng đã xác nhận vẫn phải thực hiện xong.</w:t>
       </w:r>
     </w:p>
     <w:p>
@@ -1451,7 +1451,7 @@
           <w:sz w:val="26"/>
           <w:szCs w:val="26"/>
         </w:rPr>
-        <w:t xml:space="preserve">9.4. Nếu sự kiện bất khả kháng kéo dài quá {o_27}  ngày liên tục, mỗi bên có quyền chấm dứt hợp đồng bằng văn bản; các bên thanh toán cho nhau phần công việc, hàng hóa đã thực hiện và được nghiệm thu đến thời điểm chấm dứt.</w:t>
+        <w:t xml:space="preserve">9.4. Nếu sự kiện bất khả kháng kéo dài quá {o_25}  ngày liên tục, mỗi bên có quyền chấm dứt hợp đồng bằng văn bản; các bên thanh toán cho nhau phần công việc, hàng hóa đã thực hiện và được nghiệm thu đến thời điểm chấm dứt.</w:t>
       </w:r>
     </w:p>
     <w:p>
@@ -1465,7 +1465,7 @@
           <w:sz w:val="26"/>
           <w:szCs w:val="26"/>
         </w:rPr>
-        <w:t xml:space="preserve">9.5. Khi hoàn cảnh thay đổi cơ bản theo Điều 420 Bộ luật Dân sự (ví dụ: giá vật liệu chính biến động bất thường vượt quá {o_28} % so với thời điểm ký), bên bị ảnh hưởng có quyền đề nghị đàm phán lại phần giá và tiến độ liên quan trong thời hạn hợp lý.</w:t>
+        <w:t xml:space="preserve">9.5. Khi hoàn cảnh thay đổi cơ bản theo Điều 420 Bộ luật Dân sự (ví dụ: giá vật liệu chính biến động bất thường vượt quá {o_26} % so với thời điểm ký), bên bị ảnh hưởng có quyền đề nghị đàm phán lại phần giá và tiến độ liên quan trong thời hạn hợp lý.</w:t>
       </w:r>
     </w:p>
     <w:p>
@@ -1899,7 +1899,7 @@
           <w:sz w:val="26"/>
           <w:szCs w:val="26"/>
         </w:rPr>
-        <w:t xml:space="preserve">Hiệu lực từ ngày {o_29}/20{o_30}</w:t>
+        <w:t xml:space="preserve">Hiệu lực từ ngày {o_27}/20{o_28}</w:t>
       </w:r>
     </w:p>
     <w:tbl>
@@ -2595,7 +2595,7 @@
                 <w:sz w:val="24"/>
                 <w:szCs w:val="24"/>
               </w:rPr>
-              <w:t xml:space="preserve">Bê tông thương phẩm M{o_31}, độ sụt {o_32}</w:t>
+              <w:t xml:space="preserve">Bê tông thương phẩm M{o_29}, độ sụt {o_30}</w:t>
             </w:r>
           </w:p>
         </w:tc>
@@ -2792,7 +2792,7 @@
                 <w:sz w:val="24"/>
                 <w:szCs w:val="24"/>
               </w:rPr>
-              <w:t xml:space="preserve">Gạch {o_33}</w:t>
+              <w:t xml:space="preserve">Gạch {o_31}</w:t>
             </w:r>
           </w:p>
         </w:tc>
@@ -3368,7 +3368,7 @@
           <w:sz w:val="26"/>
           <w:szCs w:val="26"/>
         </w:rPr>
-        <w:t xml:space="preserve">Số: {o_34}/ĐĐH-NVC – Ngày {o_35}/20{o_36} – Theo Hợp đồng nguyên tắc số {o_37}</w:t>
+        <w:t xml:space="preserve">Số: {o_32}/ĐĐH-NVC – Ngày {o_33}/20{o_34} – Theo Hợp đồng nguyên tắc số {o_35}</w:t>
       </w:r>
     </w:p>
     <w:p>
@@ -3382,7 +3382,7 @@
           <w:sz w:val="26"/>
           <w:szCs w:val="26"/>
         </w:rPr>
-        <w:t xml:space="preserve">Bên mua: CÔNG TY TNHH TƯ VẤN XÂY DỰNG VÀ PHÁT TRIỂN NHÀ VIỆT. Người đặt hàng: {o_38} – ĐT: {o_39}</w:t>
+        <w:t xml:space="preserve">Bên mua: CÔNG TY TNHH TƯ VẤN XÂY DỰNG VÀ PHÁT TRIỂN NHÀ VIỆT. Người đặt hàng: {o_36} – ĐT: {o_37}</w:t>
       </w:r>
     </w:p>
     <w:p>
@@ -3396,7 +3396,7 @@
           <w:sz w:val="26"/>
           <w:szCs w:val="26"/>
         </w:rPr>
-        <w:t xml:space="preserve">Bên bán: {o_40}</w:t>
+        <w:t xml:space="preserve">Bên bán: {o_38}</w:t>
       </w:r>
     </w:p>
     <w:p>
@@ -3410,7 +3410,7 @@
           <w:sz w:val="26"/>
           <w:szCs w:val="26"/>
         </w:rPr>
-        <w:t xml:space="preserve">Công trình/mã dự án: {o_41} – Địa chỉ giao hàng: {o_42}</w:t>
+        <w:t xml:space="preserve">Công trình/mã dự án: {o_39} – Địa chỉ giao hàng: {o_40}</w:t>
       </w:r>
     </w:p>
     <w:tbl>
@@ -4399,7 +4399,7 @@
           <w:sz w:val="26"/>
           <w:szCs w:val="26"/>
         </w:rPr>
-        <w:t xml:space="preserve">Yêu cầu kèm theo: CO/CQ; phiếu cân; phiếu giao bê tông; {o_43}</w:t>
+        <w:t xml:space="preserve">Yêu cầu kèm theo: CO/CQ; phiếu cân; phiếu giao bê tông; {o_41}</w:t>
       </w:r>
     </w:p>
     <w:p>

</xml_diff>